<commit_message>
Plus qu'a faire le dernier algo
</commit_message>
<xml_diff>
--- a/Rapport.docx
+++ b/Rapport.docx
@@ -1,6 +1,6 @@
 
 <file path=word/document.xml><?xml version="1.0" encoding="utf-8"?>
-<w:document xmlns:wpc="http://schemas.microsoft.com/office/word/2010/wordprocessingCanvas" xmlns:cx="http://schemas.microsoft.com/office/drawing/2014/chartex" xmlns:cx1="http://schemas.microsoft.com/office/drawing/2015/9/8/chartex" xmlns:cx2="http://schemas.microsoft.com/office/drawing/2015/10/21/chartex" xmlns:cx3="http://schemas.microsoft.com/office/drawing/2016/5/9/chartex" xmlns:cx4="http://schemas.microsoft.com/office/drawing/2016/5/10/chartex" xmlns:cx5="http://schemas.microsoft.com/office/drawing/2016/5/11/chartex" xmlns:cx6="http://schemas.microsoft.com/office/drawing/2016/5/12/chartex" xmlns:cx7="http://schemas.microsoft.com/office/drawing/2016/5/13/chartex" xmlns:cx8="http://schemas.microsoft.com/office/drawing/2016/5/14/chartex" xmlns:mc="http://schemas.openxmlformats.org/markup-compatibility/2006" xmlns:aink="http://schemas.microsoft.com/office/drawing/2016/ink" xmlns:am3d="http://schemas.microsoft.com/office/drawing/2017/model3d" xmlns:o="urn:schemas-microsoft-com:office:office" xmlns:oel="http://schemas.microsoft.com/office/2019/extlst" xmlns:r="http://schemas.openxmlformats.org/officeDocument/2006/relationships" xmlns:m="http://schemas.openxmlformats.org/officeDocument/2006/math" xmlns:v="urn:schemas-microsoft-com:vml" xmlns:wp14="http://schemas.microsoft.com/office/word/2010/wordprocessingDrawing" xmlns:wp="http://schemas.openxmlformats.org/drawingml/2006/wordprocessingDrawing" xmlns:w10="urn:schemas-microsoft-com:office:word" xmlns:w="http://schemas.openxmlformats.org/wordprocessingml/2006/main" xmlns:w14="http://schemas.microsoft.com/office/word/2010/wordml" xmlns:w15="http://schemas.microsoft.com/office/word/2012/wordml" xmlns:w16cex="http://schemas.microsoft.com/office/word/2018/wordml/cex" xmlns:w16cid="http://schemas.microsoft.com/office/word/2016/wordml/cid" xmlns:w16="http://schemas.microsoft.com/office/word/2018/wordml" xmlns:w16du="http://schemas.microsoft.com/office/word/2023/wordml/word16du" xmlns:w16sdtdh="http://schemas.microsoft.com/office/word/2020/wordml/sdtdatahash" xmlns:w16se="http://schemas.microsoft.com/office/word/2015/wordml/symex" xmlns:wpg="http://schemas.microsoft.com/office/word/2010/wordprocessingGroup" xmlns:wpi="http://schemas.microsoft.com/office/word/2010/wordprocessingInk" xmlns:wne="http://schemas.microsoft.com/office/word/2006/wordml" xmlns:wps="http://schemas.microsoft.com/office/word/2010/wordprocessingShape" mc:Ignorable="w14 w15 w16se w16cid w16 w16cex w16sdtdh w16du wp14">
+<w:document xmlns:wpc="http://schemas.microsoft.com/office/word/2010/wordprocessingCanvas" xmlns:cx="http://schemas.microsoft.com/office/drawing/2014/chartex" xmlns:cx1="http://schemas.microsoft.com/office/drawing/2015/9/8/chartex" xmlns:cx2="http://schemas.microsoft.com/office/drawing/2015/10/21/chartex" xmlns:cx3="http://schemas.microsoft.com/office/drawing/2016/5/9/chartex" xmlns:cx4="http://schemas.microsoft.com/office/drawing/2016/5/10/chartex" xmlns:cx5="http://schemas.microsoft.com/office/drawing/2016/5/11/chartex" xmlns:cx6="http://schemas.microsoft.com/office/drawing/2016/5/12/chartex" xmlns:cx7="http://schemas.microsoft.com/office/drawing/2016/5/13/chartex" xmlns:cx8="http://schemas.microsoft.com/office/drawing/2016/5/14/chartex" xmlns:mc="http://schemas.openxmlformats.org/markup-compatibility/2006" xmlns:aink="http://schemas.microsoft.com/office/drawing/2016/ink" xmlns:am3d="http://schemas.microsoft.com/office/drawing/2017/model3d" xmlns:o="urn:schemas-microsoft-com:office:office" xmlns:oel="http://schemas.microsoft.com/office/2019/extlst" xmlns:r="http://schemas.openxmlformats.org/officeDocument/2006/relationships" xmlns:m="http://schemas.openxmlformats.org/officeDocument/2006/math" xmlns:v="urn:schemas-microsoft-com:vml" xmlns:wp14="http://schemas.microsoft.com/office/word/2010/wordprocessingDrawing" xmlns:wp="http://schemas.openxmlformats.org/drawingml/2006/wordprocessingDrawing" xmlns:w10="urn:schemas-microsoft-com:office:word" xmlns:w="http://schemas.openxmlformats.org/wordprocessingml/2006/main" xmlns:w14="http://schemas.microsoft.com/office/word/2010/wordml" xmlns:w15="http://schemas.microsoft.com/office/word/2012/wordml" xmlns:w16cex="http://schemas.microsoft.com/office/word/2018/wordml/cex" xmlns:w16cid="http://schemas.microsoft.com/office/word/2016/wordml/cid" xmlns:w16="http://schemas.microsoft.com/office/word/2018/wordml" xmlns:w16du="http://schemas.microsoft.com/office/word/2023/wordml/word16du" xmlns:w16sdtdh="http://schemas.microsoft.com/office/word/2020/wordml/sdtdatahash" xmlns:w16sdtfl="http://schemas.microsoft.com/office/word/2024/wordml/sdtformatlock" xmlns:w16se="http://schemas.microsoft.com/office/word/2015/wordml/symex" xmlns:wpg="http://schemas.microsoft.com/office/word/2010/wordprocessingGroup" xmlns:wpi="http://schemas.microsoft.com/office/word/2010/wordprocessingInk" xmlns:wne="http://schemas.microsoft.com/office/word/2006/wordml" xmlns:wps="http://schemas.microsoft.com/office/word/2010/wordprocessingShape" mc:Ignorable="w14 w15 w16se w16cid w16 w16cex w16sdtdh w16sdtfl w16du wp14">
   <w:body>
     <w:sdt>
       <w:sdtPr>
@@ -2486,6 +2486,269 @@
       <w:bookmarkEnd w:id="7"/>
       <w:proofErr w:type="spellEnd"/>
     </w:p>
+    <w:p>
+      <w:r>
+        <w:rPr>
+          <w:b/>
+          <w:bCs/>
+        </w:rPr>
+        <w:t xml:space="preserve">Fonction </w:t>
+      </w:r>
+      <w:proofErr w:type="spellStart"/>
+      <w:proofErr w:type="gramStart"/>
+      <w:r>
+        <w:rPr>
+          <w:b/>
+          <w:bCs/>
+        </w:rPr>
+        <w:t>OutNeurone</w:t>
+      </w:r>
+      <w:proofErr w:type="spellEnd"/>
+      <w:r>
+        <w:rPr>
+          <w:b/>
+          <w:bCs/>
+        </w:rPr>
+        <w:t>(</w:t>
+      </w:r>
+      <w:proofErr w:type="gramEnd"/>
+      <w:r>
+        <w:rPr>
+          <w:b/>
+          <w:bCs/>
+        </w:rPr>
+        <w:t xml:space="preserve">neurone : Neurone , </w:t>
+      </w:r>
+      <w:proofErr w:type="spellStart"/>
+      <w:r>
+        <w:rPr>
+          <w:b/>
+          <w:bCs/>
+        </w:rPr>
+        <w:t>listeEntiers</w:t>
+      </w:r>
+      <w:proofErr w:type="spellEnd"/>
+      <w:r>
+        <w:rPr>
+          <w:b/>
+          <w:bCs/>
+        </w:rPr>
+        <w:t xml:space="preserve"> : Tableau d’entier) : Entier</w:t>
+      </w:r>
+      <w:r>
+        <w:rPr>
+          <w:b/>
+          <w:bCs/>
+        </w:rPr>
+        <w:br/>
+        <w:t>Début</w:t>
+      </w:r>
+      <w:r>
+        <w:br/>
+        <w:t xml:space="preserve">    Size : Entier &lt;- </w:t>
+      </w:r>
+      <w:proofErr w:type="spellStart"/>
+      <w:r>
+        <w:t>nbEntrees</w:t>
+      </w:r>
+      <w:proofErr w:type="spellEnd"/>
+      <w:r>
+        <w:t>(neurone)</w:t>
+      </w:r>
+      <w:r>
+        <w:br/>
+        <w:t xml:space="preserve">    Somme : Entier &lt;- 0</w:t>
+      </w:r>
+      <w:r>
+        <w:br/>
+        <w:t xml:space="preserve">    </w:t>
+      </w:r>
+      <w:proofErr w:type="spellStart"/>
+      <w:r>
+        <w:t>tmp</w:t>
+      </w:r>
+      <w:proofErr w:type="spellEnd"/>
+      <w:r>
+        <w:t> : Poids &lt;- poids(neurone)</w:t>
+      </w:r>
+      <w:r>
+        <w:br/>
+        <w:t xml:space="preserve">    </w:t>
+      </w:r>
+      <w:r>
+        <w:rPr>
+          <w:b/>
+          <w:bCs/>
+        </w:rPr>
+        <w:t>Pour</w:t>
+      </w:r>
+      <w:r>
+        <w:t xml:space="preserve"> i allant de 0 a Size</w:t>
+      </w:r>
+      <w:r>
+        <w:t>-1</w:t>
+      </w:r>
+      <w:r>
+        <w:t xml:space="preserve"> </w:t>
+      </w:r>
+      <w:r>
+        <w:rPr>
+          <w:b/>
+          <w:bCs/>
+        </w:rPr>
+        <w:t>faire</w:t>
+      </w:r>
+      <w:r>
+        <w:br/>
+        <w:t xml:space="preserve">        Somme &lt;- Somme + </w:t>
+      </w:r>
+      <w:proofErr w:type="spellStart"/>
+      <w:r>
+        <w:t>listeEntier</w:t>
+      </w:r>
+      <w:proofErr w:type="spellEnd"/>
+      <w:r>
+        <w:t>[i] x mass(</w:t>
+      </w:r>
+      <w:proofErr w:type="spellStart"/>
+      <w:r>
+        <w:t>tmp</w:t>
+      </w:r>
+      <w:proofErr w:type="spellEnd"/>
+      <w:r>
+        <w:t xml:space="preserve">) // Le x </w:t>
+      </w:r>
+      <w:proofErr w:type="spellStart"/>
+      <w:r>
+        <w:t>represente</w:t>
+      </w:r>
+      <w:proofErr w:type="spellEnd"/>
+      <w:r>
+        <w:t xml:space="preserve"> un multiplie </w:t>
+      </w:r>
+      <w:r>
+        <w:br/>
+        <w:t xml:space="preserve">        </w:t>
+      </w:r>
+      <w:proofErr w:type="spellStart"/>
+      <w:r>
+        <w:t>tmp</w:t>
+      </w:r>
+      <w:proofErr w:type="spellEnd"/>
+      <w:r>
+        <w:t xml:space="preserve"> &lt;- </w:t>
+      </w:r>
+      <w:proofErr w:type="spellStart"/>
+      <w:r>
+        <w:t>succ</w:t>
+      </w:r>
+      <w:proofErr w:type="spellEnd"/>
+      <w:r>
+        <w:t>(</w:t>
+      </w:r>
+      <w:proofErr w:type="spellStart"/>
+      <w:r>
+        <w:t>tmp</w:t>
+      </w:r>
+      <w:proofErr w:type="spellEnd"/>
+      <w:r>
+        <w:t>)</w:t>
+      </w:r>
+      <w:r>
+        <w:br/>
+        <w:t xml:space="preserve">    </w:t>
+      </w:r>
+      <w:r>
+        <w:rPr>
+          <w:b/>
+          <w:bCs/>
+        </w:rPr>
+        <w:t>Fin Pour</w:t>
+      </w:r>
+      <w:r>
+        <w:rPr>
+          <w:b/>
+          <w:bCs/>
+        </w:rPr>
+        <w:br/>
+      </w:r>
+      <w:r>
+        <w:t xml:space="preserve">    </w:t>
+      </w:r>
+      <w:r>
+        <w:rPr>
+          <w:b/>
+          <w:bCs/>
+        </w:rPr>
+        <w:t>Si</w:t>
+      </w:r>
+      <w:r>
+        <w:t xml:space="preserve"> somme &gt;= seuil(neurone) </w:t>
+      </w:r>
+      <w:r>
+        <w:rPr>
+          <w:b/>
+          <w:bCs/>
+        </w:rPr>
+        <w:t>alors</w:t>
+      </w:r>
+      <w:r>
+        <w:br/>
+        <w:t xml:space="preserve">        </w:t>
+      </w:r>
+      <w:proofErr w:type="spellStart"/>
+      <w:r>
+        <w:t>OutNeurone</w:t>
+      </w:r>
+      <w:proofErr w:type="spellEnd"/>
+      <w:r>
+        <w:t xml:space="preserve"> &lt;- 1</w:t>
+      </w:r>
+      <w:r>
+        <w:br/>
+        <w:t xml:space="preserve">    </w:t>
+      </w:r>
+      <w:r>
+        <w:rPr>
+          <w:b/>
+          <w:bCs/>
+        </w:rPr>
+        <w:t>Sinon</w:t>
+      </w:r>
+      <w:r>
+        <w:t xml:space="preserve"> </w:t>
+      </w:r>
+      <w:r>
+        <w:br/>
+        <w:t xml:space="preserve">        </w:t>
+      </w:r>
+      <w:proofErr w:type="spellStart"/>
+      <w:r>
+        <w:t>OutNeurone</w:t>
+      </w:r>
+      <w:proofErr w:type="spellEnd"/>
+      <w:r>
+        <w:t xml:space="preserve"> &lt;- 0</w:t>
+      </w:r>
+      <w:r>
+        <w:br/>
+      </w:r>
+      <w:r>
+        <w:rPr>
+          <w:b/>
+          <w:bCs/>
+        </w:rPr>
+        <w:t xml:space="preserve">    Fin SI</w:t>
+      </w:r>
+      <w:r>
+        <w:rPr>
+          <w:b/>
+          <w:bCs/>
+        </w:rPr>
+        <w:br/>
+        <w:t>Fin</w:t>
+      </w:r>
+    </w:p>
     <w:p/>
     <w:p>
       <w:pPr>
@@ -2503,6 +2766,476 @@
       <w:bookmarkEnd w:id="8"/>
       <w:proofErr w:type="spellEnd"/>
     </w:p>
+    <w:p>
+      <w:pPr>
+        <w:rPr>
+          <w:b/>
+          <w:bCs/>
+        </w:rPr>
+      </w:pPr>
+      <w:r>
+        <w:rPr>
+          <w:b/>
+          <w:bCs/>
+        </w:rPr>
+        <w:t xml:space="preserve">Fonction </w:t>
+      </w:r>
+      <w:proofErr w:type="spellStart"/>
+      <w:r>
+        <w:rPr>
+          <w:b/>
+          <w:bCs/>
+        </w:rPr>
+        <w:t>InitCouche</w:t>
+      </w:r>
+      <w:proofErr w:type="spellEnd"/>
+      <w:r>
+        <w:rPr>
+          <w:b/>
+          <w:bCs/>
+        </w:rPr>
+        <w:t>(</w:t>
+      </w:r>
+      <w:proofErr w:type="spellStart"/>
+      <w:r>
+        <w:rPr>
+          <w:b/>
+          <w:bCs/>
+        </w:rPr>
+        <w:t>nbEntrees</w:t>
+      </w:r>
+      <w:proofErr w:type="spellEnd"/>
+      <w:r>
+        <w:rPr>
+          <w:b/>
+          <w:bCs/>
+        </w:rPr>
+        <w:t xml:space="preserve"> : Entier , </w:t>
+      </w:r>
+      <w:proofErr w:type="spellStart"/>
+      <w:r>
+        <w:rPr>
+          <w:b/>
+          <w:bCs/>
+        </w:rPr>
+        <w:t>nbNeurones</w:t>
+      </w:r>
+      <w:proofErr w:type="spellEnd"/>
+      <w:r>
+        <w:rPr>
+          <w:b/>
+          <w:bCs/>
+        </w:rPr>
+        <w:t xml:space="preserve"> : Entier ) : Couche</w:t>
+      </w:r>
+      <w:r>
+        <w:rPr>
+          <w:b/>
+          <w:bCs/>
+        </w:rPr>
+        <w:br/>
+        <w:t>Début</w:t>
+      </w:r>
+      <w:r>
+        <w:br/>
+      </w:r>
+      <w:r>
+        <w:rPr>
+          <w:b/>
+          <w:bCs/>
+        </w:rPr>
+        <w:t xml:space="preserve">    </w:t>
+      </w:r>
+      <w:proofErr w:type="spellStart"/>
+      <w:r>
+        <w:t>listeNeurones</w:t>
+      </w:r>
+      <w:proofErr w:type="spellEnd"/>
+      <w:r>
+        <w:t xml:space="preserve"> &lt;- </w:t>
+      </w:r>
+      <w:proofErr w:type="spellStart"/>
+      <w:r>
+        <w:t>listeVide</w:t>
+      </w:r>
+      <w:proofErr w:type="spellEnd"/>
+      <w:r>
+        <w:t>()</w:t>
+      </w:r>
+      <w:r>
+        <w:br/>
+      </w:r>
+      <w:r>
+        <w:rPr>
+          <w:b/>
+          <w:bCs/>
+        </w:rPr>
+        <w:t xml:space="preserve">    </w:t>
+      </w:r>
+      <w:proofErr w:type="spellStart"/>
+      <w:r>
+        <w:t>tmp</w:t>
+      </w:r>
+      <w:proofErr w:type="spellEnd"/>
+      <w:r>
+        <w:t xml:space="preserve"> : Neurone</w:t>
+      </w:r>
+      <w:r>
+        <w:br/>
+      </w:r>
+      <w:r>
+        <w:rPr>
+          <w:b/>
+          <w:bCs/>
+        </w:rPr>
+        <w:t xml:space="preserve">    Pour</w:t>
+      </w:r>
+      <w:r>
+        <w:t xml:space="preserve"> i allant de 0 à nbNeurones</w:t>
+      </w:r>
+      <w:r>
+        <w:t>-1</w:t>
+      </w:r>
+      <w:r>
+        <w:t xml:space="preserve"> </w:t>
+      </w:r>
+      <w:r>
+        <w:rPr>
+          <w:b/>
+          <w:bCs/>
+        </w:rPr>
+        <w:t>Faire</w:t>
+      </w:r>
+      <w:r>
+        <w:t xml:space="preserve"> </w:t>
+      </w:r>
+      <w:r>
+        <w:br/>
+      </w:r>
+      <w:r>
+        <w:rPr>
+          <w:b/>
+          <w:bCs/>
+        </w:rPr>
+        <w:t xml:space="preserve">        </w:t>
+      </w:r>
+      <w:r>
+        <w:t>Ecrire(« i + 1 »</w:t>
+      </w:r>
+      <w:proofErr w:type="spellStart"/>
+      <w:r>
+        <w:t>eme</w:t>
+      </w:r>
+      <w:proofErr w:type="spellEnd"/>
+      <w:r>
+        <w:t xml:space="preserve"> </w:t>
+      </w:r>
+      <w:proofErr w:type="spellStart"/>
+      <w:r>
+        <w:t>Neuronne</w:t>
+      </w:r>
+      <w:proofErr w:type="spellEnd"/>
+      <w:r>
+        <w:t xml:space="preserve"> )</w:t>
+      </w:r>
+      <w:r>
+        <w:br/>
+      </w:r>
+      <w:r>
+        <w:rPr>
+          <w:b/>
+          <w:bCs/>
+        </w:rPr>
+        <w:t xml:space="preserve">        </w:t>
+      </w:r>
+      <w:proofErr w:type="spellStart"/>
+      <w:r>
+        <w:t>newNeuronne</w:t>
+      </w:r>
+      <w:proofErr w:type="spellEnd"/>
+      <w:r>
+        <w:t xml:space="preserve"> : Neurone &lt;- </w:t>
+      </w:r>
+      <w:proofErr w:type="spellStart"/>
+      <w:r>
+        <w:t>InitNeur</w:t>
+      </w:r>
+      <w:proofErr w:type="spellEnd"/>
+      <w:r>
+        <w:t>(</w:t>
+      </w:r>
+      <w:proofErr w:type="spellStart"/>
+      <w:r>
+        <w:t>nbEntrees</w:t>
+      </w:r>
+      <w:proofErr w:type="spellEnd"/>
+      <w:r>
+        <w:t>)</w:t>
+      </w:r>
+      <w:r>
+        <w:br/>
+      </w:r>
+      <w:r>
+        <w:rPr>
+          <w:b/>
+          <w:bCs/>
+        </w:rPr>
+        <w:lastRenderedPageBreak/>
+        <w:t xml:space="preserve">        </w:t>
+      </w:r>
+      <w:proofErr w:type="spellStart"/>
+      <w:r>
+        <w:t>succ</w:t>
+      </w:r>
+      <w:proofErr w:type="spellEnd"/>
+      <w:r>
+        <w:t>(</w:t>
+      </w:r>
+      <w:proofErr w:type="spellStart"/>
+      <w:r>
+        <w:t>newNeuronne</w:t>
+      </w:r>
+      <w:proofErr w:type="spellEnd"/>
+      <w:r>
+        <w:t>) &lt;- NULL</w:t>
+      </w:r>
+      <w:r>
+        <w:br/>
+      </w:r>
+      <w:r>
+        <w:rPr>
+          <w:b/>
+          <w:bCs/>
+        </w:rPr>
+        <w:t xml:space="preserve">        Si</w:t>
+      </w:r>
+      <w:r>
+        <w:t xml:space="preserve"> i = 0 </w:t>
+      </w:r>
+      <w:r>
+        <w:rPr>
+          <w:b/>
+          <w:bCs/>
+        </w:rPr>
+        <w:t>Alors</w:t>
+      </w:r>
+      <w:r>
+        <w:br/>
+      </w:r>
+      <w:r>
+        <w:rPr>
+          <w:b/>
+          <w:bCs/>
+        </w:rPr>
+        <w:t xml:space="preserve">            </w:t>
+      </w:r>
+      <w:proofErr w:type="spellStart"/>
+      <w:r>
+        <w:t>listeNeurones</w:t>
+      </w:r>
+      <w:proofErr w:type="spellEnd"/>
+      <w:r>
+        <w:t xml:space="preserve">  &lt;- </w:t>
+      </w:r>
+      <w:proofErr w:type="spellStart"/>
+      <w:r>
+        <w:t>newNeuronne</w:t>
+      </w:r>
+      <w:proofErr w:type="spellEnd"/>
+      <w:r>
+        <w:t xml:space="preserve"> </w:t>
+      </w:r>
+      <w:r>
+        <w:br/>
+      </w:r>
+      <w:r>
+        <w:rPr>
+          <w:b/>
+          <w:bCs/>
+        </w:rPr>
+        <w:t xml:space="preserve">        Sinon</w:t>
+      </w:r>
+      <w:r>
+        <w:br/>
+      </w:r>
+      <w:r>
+        <w:rPr>
+          <w:b/>
+          <w:bCs/>
+        </w:rPr>
+        <w:t xml:space="preserve">            </w:t>
+      </w:r>
+      <w:proofErr w:type="spellStart"/>
+      <w:r>
+        <w:t>succ</w:t>
+      </w:r>
+      <w:proofErr w:type="spellEnd"/>
+      <w:r>
+        <w:t>(</w:t>
+      </w:r>
+      <w:proofErr w:type="spellStart"/>
+      <w:r>
+        <w:t>tmp</w:t>
+      </w:r>
+      <w:proofErr w:type="spellEnd"/>
+      <w:r>
+        <w:t xml:space="preserve">) &lt;- </w:t>
+      </w:r>
+      <w:proofErr w:type="spellStart"/>
+      <w:r>
+        <w:t>newNeuronne</w:t>
+      </w:r>
+      <w:proofErr w:type="spellEnd"/>
+      <w:r>
+        <w:br/>
+      </w:r>
+      <w:r>
+        <w:rPr>
+          <w:b/>
+          <w:bCs/>
+        </w:rPr>
+        <w:t xml:space="preserve">        Fin Si</w:t>
+      </w:r>
+      <w:r>
+        <w:rPr>
+          <w:b/>
+          <w:bCs/>
+        </w:rPr>
+        <w:br/>
+        <w:t xml:space="preserve">        </w:t>
+      </w:r>
+      <w:proofErr w:type="spellStart"/>
+      <w:r>
+        <w:t>tmp</w:t>
+      </w:r>
+      <w:proofErr w:type="spellEnd"/>
+      <w:r>
+        <w:t xml:space="preserve"> &lt;- </w:t>
+      </w:r>
+      <w:proofErr w:type="spellStart"/>
+      <w:r>
+        <w:t>newNeuronne</w:t>
+      </w:r>
+      <w:proofErr w:type="spellEnd"/>
+      <w:r>
+        <w:br/>
+      </w:r>
+      <w:r>
+        <w:rPr>
+          <w:b/>
+          <w:bCs/>
+        </w:rPr>
+        <w:t xml:space="preserve">    Fin Pour</w:t>
+      </w:r>
+      <w:r>
+        <w:br/>
+      </w:r>
+      <w:r>
+        <w:rPr>
+          <w:b/>
+          <w:bCs/>
+        </w:rPr>
+        <w:t xml:space="preserve">    </w:t>
+      </w:r>
+      <w:r>
+        <w:t xml:space="preserve">couche : Couche &lt;- </w:t>
+      </w:r>
+      <w:proofErr w:type="spellStart"/>
+      <w:r>
+        <w:t>créerElement</w:t>
+      </w:r>
+      <w:proofErr w:type="spellEnd"/>
+      <w:r>
+        <w:t>()</w:t>
+      </w:r>
+      <w:r>
+        <w:br/>
+      </w:r>
+      <w:r>
+        <w:rPr>
+          <w:b/>
+          <w:bCs/>
+        </w:rPr>
+        <w:t xml:space="preserve">    </w:t>
+      </w:r>
+      <w:proofErr w:type="spellStart"/>
+      <w:r>
+        <w:t>succ</w:t>
+      </w:r>
+      <w:proofErr w:type="spellEnd"/>
+      <w:r>
+        <w:t>(couche) &lt;- NULL</w:t>
+      </w:r>
+      <w:r>
+        <w:br/>
+      </w:r>
+      <w:r>
+        <w:rPr>
+          <w:b/>
+          <w:bCs/>
+        </w:rPr>
+        <w:t xml:space="preserve">    </w:t>
+      </w:r>
+      <w:r>
+        <w:t xml:space="preserve">neurone(couche) &lt;- </w:t>
+      </w:r>
+      <w:proofErr w:type="spellStart"/>
+      <w:r>
+        <w:t>listeNeurones</w:t>
+      </w:r>
+      <w:proofErr w:type="spellEnd"/>
+      <w:r>
+        <w:br/>
+      </w:r>
+      <w:r>
+        <w:rPr>
+          <w:b/>
+          <w:bCs/>
+        </w:rPr>
+        <w:t xml:space="preserve">    </w:t>
+      </w:r>
+      <w:proofErr w:type="spellStart"/>
+      <w:r>
+        <w:t>nbNeurones</w:t>
+      </w:r>
+      <w:proofErr w:type="spellEnd"/>
+      <w:r>
+        <w:t>(couche)&lt;-</w:t>
+      </w:r>
+      <w:proofErr w:type="spellStart"/>
+      <w:r>
+        <w:t>nbNeurones</w:t>
+      </w:r>
+      <w:proofErr w:type="spellEnd"/>
+      <w:r>
+        <w:br/>
+      </w:r>
+      <w:r>
+        <w:rPr>
+          <w:b/>
+          <w:bCs/>
+        </w:rPr>
+        <w:t xml:space="preserve">    </w:t>
+      </w:r>
+      <w:proofErr w:type="spellStart"/>
+      <w:r>
+        <w:t>InitCouche</w:t>
+      </w:r>
+      <w:proofErr w:type="spellEnd"/>
+      <w:r>
+        <w:t xml:space="preserve"> &lt;- couche</w:t>
+      </w:r>
+      <w:r>
+        <w:br/>
+      </w:r>
+      <w:r>
+        <w:rPr>
+          <w:b/>
+          <w:bCs/>
+        </w:rPr>
+        <w:t>Fin</w:t>
+      </w:r>
+    </w:p>
     <w:p/>
     <w:p>
       <w:pPr>
@@ -2520,6 +3253,265 @@
       <w:bookmarkEnd w:id="9"/>
       <w:proofErr w:type="spellEnd"/>
     </w:p>
+    <w:p>
+      <w:proofErr w:type="spellStart"/>
+      <w:r>
+        <w:rPr>
+          <w:b/>
+          <w:bCs/>
+        </w:rPr>
+        <w:t>Procedure</w:t>
+      </w:r>
+      <w:proofErr w:type="spellEnd"/>
+      <w:r>
+        <w:rPr>
+          <w:b/>
+          <w:bCs/>
+        </w:rPr>
+        <w:t xml:space="preserve"> </w:t>
+      </w:r>
+      <w:proofErr w:type="spellStart"/>
+      <w:proofErr w:type="gramStart"/>
+      <w:r>
+        <w:rPr>
+          <w:b/>
+          <w:bCs/>
+        </w:rPr>
+        <w:t>OutCouche</w:t>
+      </w:r>
+      <w:proofErr w:type="spellEnd"/>
+      <w:r>
+        <w:rPr>
+          <w:b/>
+          <w:bCs/>
+        </w:rPr>
+        <w:t>(</w:t>
+      </w:r>
+      <w:proofErr w:type="gramEnd"/>
+      <w:r>
+        <w:rPr>
+          <w:b/>
+          <w:bCs/>
+        </w:rPr>
+        <w:t xml:space="preserve">couche : Couche, </w:t>
+      </w:r>
+      <w:proofErr w:type="spellStart"/>
+      <w:r>
+        <w:rPr>
+          <w:b/>
+          <w:bCs/>
+        </w:rPr>
+        <w:t>listeEntier</w:t>
+      </w:r>
+      <w:proofErr w:type="spellEnd"/>
+      <w:r>
+        <w:rPr>
+          <w:b/>
+          <w:bCs/>
+        </w:rPr>
+        <w:t xml:space="preserve"> : </w:t>
+      </w:r>
+      <w:r>
+        <w:rPr>
+          <w:b/>
+          <w:bCs/>
+        </w:rPr>
+        <w:t>Liste</w:t>
+      </w:r>
+      <w:r>
+        <w:rPr>
+          <w:b/>
+          <w:bCs/>
+        </w:rPr>
+        <w:t xml:space="preserve"> d’entiers , </w:t>
+      </w:r>
+      <w:proofErr w:type="spellStart"/>
+      <w:r>
+        <w:rPr>
+          <w:b/>
+          <w:bCs/>
+        </w:rPr>
+        <w:t>listeSortie</w:t>
+      </w:r>
+      <w:proofErr w:type="spellEnd"/>
+      <w:r>
+        <w:rPr>
+          <w:b/>
+          <w:bCs/>
+        </w:rPr>
+        <w:t xml:space="preserve"> : </w:t>
+      </w:r>
+      <w:r>
+        <w:rPr>
+          <w:b/>
+          <w:bCs/>
+        </w:rPr>
+        <w:t>Liste</w:t>
+      </w:r>
+      <w:r>
+        <w:rPr>
+          <w:b/>
+          <w:bCs/>
+        </w:rPr>
+        <w:t xml:space="preserve"> </w:t>
+      </w:r>
+      <w:r>
+        <w:rPr>
+          <w:b/>
+          <w:bCs/>
+        </w:rPr>
+        <w:t xml:space="preserve">d’entiers) </w:t>
+      </w:r>
+      <w:r>
+        <w:rPr>
+          <w:b/>
+          <w:bCs/>
+        </w:rPr>
+        <w:br/>
+        <w:t>Début</w:t>
+      </w:r>
+      <w:r>
+        <w:br/>
+      </w:r>
+      <w:r>
+        <w:rPr>
+          <w:b/>
+          <w:bCs/>
+        </w:rPr>
+        <w:t xml:space="preserve">    </w:t>
+      </w:r>
+      <w:proofErr w:type="spellStart"/>
+      <w:r>
+        <w:t>tmp</w:t>
+      </w:r>
+      <w:proofErr w:type="spellEnd"/>
+      <w:r>
+        <w:t xml:space="preserve"> : Neurone &lt;- neurone(couche)</w:t>
+      </w:r>
+      <w:r>
+        <w:br/>
+      </w:r>
+      <w:r>
+        <w:rPr>
+          <w:b/>
+          <w:bCs/>
+        </w:rPr>
+        <w:t xml:space="preserve">    </w:t>
+      </w:r>
+      <w:r>
+        <w:rPr>
+          <w:b/>
+          <w:bCs/>
+        </w:rPr>
+        <w:t>Pour</w:t>
+      </w:r>
+      <w:r>
+        <w:t xml:space="preserve"> i allant de 0 à </w:t>
+      </w:r>
+      <w:proofErr w:type="spellStart"/>
+      <w:r>
+        <w:t>nbNeurone</w:t>
+      </w:r>
+      <w:proofErr w:type="spellEnd"/>
+      <w:r>
+        <w:t xml:space="preserve">(couche) - 1 </w:t>
+      </w:r>
+      <w:r>
+        <w:rPr>
+          <w:b/>
+          <w:bCs/>
+        </w:rPr>
+        <w:t>faire</w:t>
+      </w:r>
+      <w:r>
+        <w:br/>
+      </w:r>
+      <w:r>
+        <w:rPr>
+          <w:b/>
+          <w:bCs/>
+        </w:rPr>
+        <w:t xml:space="preserve">        </w:t>
+      </w:r>
+      <w:proofErr w:type="spellStart"/>
+      <w:r>
+        <w:t>listeSortie</w:t>
+      </w:r>
+      <w:proofErr w:type="spellEnd"/>
+      <w:r>
+        <w:t xml:space="preserve">[i] &lt;- </w:t>
+      </w:r>
+      <w:proofErr w:type="spellStart"/>
+      <w:r>
+        <w:t>OutNeurone</w:t>
+      </w:r>
+      <w:proofErr w:type="spellEnd"/>
+      <w:r>
+        <w:t>(</w:t>
+      </w:r>
+      <w:proofErr w:type="spellStart"/>
+      <w:r>
+        <w:t>tmp,listeEntier</w:t>
+      </w:r>
+      <w:proofErr w:type="spellEnd"/>
+      <w:r>
+        <w:t>)</w:t>
+      </w:r>
+      <w:r>
+        <w:br/>
+      </w:r>
+      <w:r>
+        <w:rPr>
+          <w:b/>
+          <w:bCs/>
+        </w:rPr>
+        <w:t xml:space="preserve">        </w:t>
+      </w:r>
+      <w:proofErr w:type="spellStart"/>
+      <w:r>
+        <w:t>tmp</w:t>
+      </w:r>
+      <w:proofErr w:type="spellEnd"/>
+      <w:r>
+        <w:t xml:space="preserve"> &lt;- </w:t>
+      </w:r>
+      <w:proofErr w:type="spellStart"/>
+      <w:r>
+        <w:t>succ</w:t>
+      </w:r>
+      <w:proofErr w:type="spellEnd"/>
+      <w:r>
+        <w:t>(</w:t>
+      </w:r>
+      <w:proofErr w:type="spellStart"/>
+      <w:r>
+        <w:t>tmp</w:t>
+      </w:r>
+      <w:proofErr w:type="spellEnd"/>
+      <w:r>
+        <w:t>)</w:t>
+      </w:r>
+      <w:r>
+        <w:br/>
+      </w:r>
+      <w:r>
+        <w:rPr>
+          <w:b/>
+          <w:bCs/>
+        </w:rPr>
+        <w:t xml:space="preserve">    Fin Pour</w:t>
+      </w:r>
+      <w:r>
+        <w:br/>
+      </w:r>
+      <w:r>
+        <w:rPr>
+          <w:b/>
+          <w:bCs/>
+        </w:rPr>
+        <w:t>Fin</w:t>
+      </w:r>
+    </w:p>
     <w:p/>
     <w:p>
       <w:pPr>
@@ -2537,6 +3529,506 @@
       <w:bookmarkEnd w:id="10"/>
       <w:proofErr w:type="spellEnd"/>
     </w:p>
+    <w:p>
+      <w:r>
+        <w:rPr>
+          <w:b/>
+          <w:bCs/>
+        </w:rPr>
+        <w:t xml:space="preserve">Fonction </w:t>
+      </w:r>
+      <w:proofErr w:type="spellStart"/>
+      <w:proofErr w:type="gramStart"/>
+      <w:r>
+        <w:rPr>
+          <w:b/>
+          <w:bCs/>
+        </w:rPr>
+        <w:t>CreerResNeur</w:t>
+      </w:r>
+      <w:proofErr w:type="spellEnd"/>
+      <w:r>
+        <w:rPr>
+          <w:b/>
+          <w:bCs/>
+        </w:rPr>
+        <w:t>(</w:t>
+      </w:r>
+      <w:proofErr w:type="spellStart"/>
+      <w:proofErr w:type="gramEnd"/>
+      <w:r>
+        <w:rPr>
+          <w:b/>
+          <w:bCs/>
+        </w:rPr>
+        <w:t>nbCouche</w:t>
+      </w:r>
+      <w:proofErr w:type="spellEnd"/>
+      <w:r>
+        <w:rPr>
+          <w:b/>
+          <w:bCs/>
+        </w:rPr>
+        <w:t xml:space="preserve"> : Entier , </w:t>
+      </w:r>
+      <w:proofErr w:type="spellStart"/>
+      <w:r>
+        <w:rPr>
+          <w:b/>
+          <w:bCs/>
+        </w:rPr>
+        <w:t>listeNbNeuroneParCouche</w:t>
+      </w:r>
+      <w:proofErr w:type="spellEnd"/>
+      <w:r>
+        <w:rPr>
+          <w:b/>
+          <w:bCs/>
+        </w:rPr>
+        <w:t xml:space="preserve"> : Tableau d’entier) : Couche</w:t>
+      </w:r>
+      <w:r>
+        <w:br/>
+      </w:r>
+      <w:r>
+        <w:rPr>
+          <w:b/>
+          <w:bCs/>
+        </w:rPr>
+        <w:t>Début</w:t>
+      </w:r>
+      <w:r>
+        <w:br/>
+      </w:r>
+      <w:r>
+        <w:rPr>
+          <w:b/>
+          <w:bCs/>
+        </w:rPr>
+        <w:t xml:space="preserve">    </w:t>
+      </w:r>
+      <w:proofErr w:type="spellStart"/>
+      <w:r>
+        <w:t>listeCouches</w:t>
+      </w:r>
+      <w:proofErr w:type="spellEnd"/>
+      <w:r>
+        <w:t xml:space="preserve"> : &lt;- </w:t>
+      </w:r>
+      <w:proofErr w:type="spellStart"/>
+      <w:r>
+        <w:t>listeVide</w:t>
+      </w:r>
+      <w:proofErr w:type="spellEnd"/>
+      <w:r>
+        <w:t>()</w:t>
+      </w:r>
+      <w:r>
+        <w:br/>
+      </w:r>
+      <w:r>
+        <w:rPr>
+          <w:b/>
+          <w:bCs/>
+        </w:rPr>
+        <w:t xml:space="preserve">    </w:t>
+      </w:r>
+      <w:proofErr w:type="spellStart"/>
+      <w:r>
+        <w:t>tmp</w:t>
+      </w:r>
+      <w:proofErr w:type="spellEnd"/>
+      <w:r>
+        <w:t xml:space="preserve"> : liste de Couche</w:t>
+      </w:r>
+      <w:r>
+        <w:br/>
+      </w:r>
+      <w:r>
+        <w:rPr>
+          <w:b/>
+          <w:bCs/>
+        </w:rPr>
+        <w:t xml:space="preserve">    </w:t>
+      </w:r>
+      <w:r>
+        <w:rPr>
+          <w:b/>
+          <w:bCs/>
+        </w:rPr>
+        <w:t>Pour</w:t>
+      </w:r>
+      <w:r>
+        <w:t xml:space="preserve"> i allant de 0 à nbCouche</w:t>
+      </w:r>
+      <w:r>
+        <w:t>-1</w:t>
+      </w:r>
+      <w:r>
+        <w:t xml:space="preserve"> </w:t>
+      </w:r>
+      <w:r>
+        <w:rPr>
+          <w:b/>
+          <w:bCs/>
+        </w:rPr>
+        <w:t>faire</w:t>
+      </w:r>
+      <w:r>
+        <w:br/>
+      </w:r>
+      <w:r>
+        <w:rPr>
+          <w:b/>
+          <w:bCs/>
+        </w:rPr>
+        <w:t xml:space="preserve">        </w:t>
+      </w:r>
+      <w:r>
+        <w:t>Ecrire(« i+1 »</w:t>
+      </w:r>
+      <w:proofErr w:type="spellStart"/>
+      <w:r>
+        <w:t>eme</w:t>
+      </w:r>
+      <w:proofErr w:type="spellEnd"/>
+      <w:r>
+        <w:t xml:space="preserve"> Couche)</w:t>
+      </w:r>
+      <w:r>
+        <w:br/>
+      </w:r>
+      <w:r>
+        <w:rPr>
+          <w:b/>
+          <w:bCs/>
+        </w:rPr>
+        <w:t xml:space="preserve">        </w:t>
+      </w:r>
+      <w:proofErr w:type="spellStart"/>
+      <w:r>
+        <w:t>newCouche</w:t>
+      </w:r>
+      <w:proofErr w:type="spellEnd"/>
+      <w:r>
+        <w:t xml:space="preserve"> : liste de Couche</w:t>
+      </w:r>
+      <w:r>
+        <w:br/>
+      </w:r>
+      <w:r>
+        <w:rPr>
+          <w:b/>
+          <w:bCs/>
+        </w:rPr>
+        <w:t xml:space="preserve">        </w:t>
+      </w:r>
+      <w:r>
+        <w:rPr>
+          <w:b/>
+          <w:bCs/>
+        </w:rPr>
+        <w:t>Si</w:t>
+      </w:r>
+      <w:r>
+        <w:t xml:space="preserve"> i = 0 </w:t>
+      </w:r>
+      <w:r>
+        <w:rPr>
+          <w:b/>
+          <w:bCs/>
+        </w:rPr>
+        <w:t>faire</w:t>
+      </w:r>
+      <w:r>
+        <w:t xml:space="preserve"> </w:t>
+      </w:r>
+      <w:r>
+        <w:br/>
+      </w:r>
+      <w:r>
+        <w:rPr>
+          <w:b/>
+          <w:bCs/>
+        </w:rPr>
+        <w:t xml:space="preserve">            </w:t>
+      </w:r>
+      <w:proofErr w:type="spellStart"/>
+      <w:r>
+        <w:t>nbEntrees</w:t>
+      </w:r>
+      <w:proofErr w:type="spellEnd"/>
+      <w:r>
+        <w:t xml:space="preserve">&lt;- Demander(Quel est le nombre d’entrées </w:t>
+      </w:r>
+      <w:proofErr w:type="spellStart"/>
+      <w:r>
+        <w:t>premiere</w:t>
+      </w:r>
+      <w:proofErr w:type="spellEnd"/>
+      <w:r>
+        <w:t xml:space="preserve"> couche ?)  </w:t>
+      </w:r>
+      <w:r>
+        <w:br/>
+      </w:r>
+      <w:r>
+        <w:rPr>
+          <w:b/>
+          <w:bCs/>
+        </w:rPr>
+        <w:t xml:space="preserve">            </w:t>
+      </w:r>
+      <w:proofErr w:type="spellStart"/>
+      <w:proofErr w:type="gramStart"/>
+      <w:r>
+        <w:t>newCouche</w:t>
+      </w:r>
+      <w:proofErr w:type="spellEnd"/>
+      <w:proofErr w:type="gramEnd"/>
+      <w:r>
+        <w:t xml:space="preserve"> &lt;- </w:t>
+      </w:r>
+      <w:proofErr w:type="spellStart"/>
+      <w:r>
+        <w:t>InitCouche</w:t>
+      </w:r>
+      <w:proofErr w:type="spellEnd"/>
+      <w:r>
+        <w:t>(</w:t>
+      </w:r>
+      <w:proofErr w:type="spellStart"/>
+      <w:r>
+        <w:t>listeNbNeuroneParCouche</w:t>
+      </w:r>
+      <w:proofErr w:type="spellEnd"/>
+      <w:r>
+        <w:t>[0],</w:t>
+      </w:r>
+      <w:proofErr w:type="spellStart"/>
+      <w:r>
+        <w:t>nbEntrees</w:t>
+      </w:r>
+      <w:proofErr w:type="spellEnd"/>
+      <w:r>
+        <w:t>)</w:t>
+      </w:r>
+      <w:r>
+        <w:br/>
+      </w:r>
+      <w:r>
+        <w:rPr>
+          <w:b/>
+          <w:bCs/>
+        </w:rPr>
+        <w:lastRenderedPageBreak/>
+        <w:t xml:space="preserve">            </w:t>
+      </w:r>
+      <w:proofErr w:type="spellStart"/>
+      <w:r>
+        <w:t>listeCouches</w:t>
+      </w:r>
+      <w:proofErr w:type="spellEnd"/>
+      <w:r>
+        <w:t xml:space="preserve"> &lt;- </w:t>
+      </w:r>
+      <w:proofErr w:type="spellStart"/>
+      <w:r>
+        <w:t>newCouche</w:t>
+      </w:r>
+      <w:proofErr w:type="spellEnd"/>
+      <w:r>
+        <w:br/>
+      </w:r>
+      <w:r>
+        <w:rPr>
+          <w:b/>
+          <w:bCs/>
+        </w:rPr>
+        <w:t xml:space="preserve">        </w:t>
+      </w:r>
+      <w:r>
+        <w:rPr>
+          <w:b/>
+          <w:bCs/>
+        </w:rPr>
+        <w:t>sinon</w:t>
+      </w:r>
+      <w:r>
+        <w:t xml:space="preserve"> </w:t>
+      </w:r>
+      <w:r>
+        <w:br/>
+      </w:r>
+      <w:r>
+        <w:rPr>
+          <w:b/>
+          <w:bCs/>
+        </w:rPr>
+        <w:t xml:space="preserve">            </w:t>
+      </w:r>
+      <w:proofErr w:type="spellStart"/>
+      <w:r>
+        <w:t>newCouche</w:t>
+      </w:r>
+      <w:proofErr w:type="spellEnd"/>
+      <w:r>
+        <w:t xml:space="preserve"> &lt;- InitCouche(listeNbNeuroneParCouche[i],listeNbNeuroneParCouche[i-1])</w:t>
+      </w:r>
+      <w:r>
+        <w:br/>
+      </w:r>
+      <w:r>
+        <w:rPr>
+          <w:b/>
+          <w:bCs/>
+        </w:rPr>
+        <w:t xml:space="preserve">            </w:t>
+      </w:r>
+      <w:proofErr w:type="spellStart"/>
+      <w:r>
+        <w:t>succ</w:t>
+      </w:r>
+      <w:proofErr w:type="spellEnd"/>
+      <w:r>
+        <w:t>(</w:t>
+      </w:r>
+      <w:proofErr w:type="spellStart"/>
+      <w:r>
+        <w:t>tmp</w:t>
+      </w:r>
+      <w:proofErr w:type="spellEnd"/>
+      <w:r>
+        <w:t xml:space="preserve">) &lt;- </w:t>
+      </w:r>
+      <w:proofErr w:type="spellStart"/>
+      <w:r>
+        <w:t>newCouche</w:t>
+      </w:r>
+      <w:proofErr w:type="spellEnd"/>
+      <w:r>
+        <w:t xml:space="preserve"> </w:t>
+      </w:r>
+      <w:r>
+        <w:br/>
+      </w:r>
+      <w:r>
+        <w:rPr>
+          <w:b/>
+          <w:bCs/>
+        </w:rPr>
+        <w:t xml:space="preserve">        </w:t>
+      </w:r>
+      <w:r>
+        <w:rPr>
+          <w:b/>
+          <w:bCs/>
+        </w:rPr>
+        <w:t>Fin Si</w:t>
+      </w:r>
+      <w:r>
+        <w:br/>
+      </w:r>
+      <w:r>
+        <w:rPr>
+          <w:b/>
+          <w:bCs/>
+        </w:rPr>
+        <w:t xml:space="preserve">        </w:t>
+      </w:r>
+      <w:proofErr w:type="spellStart"/>
+      <w:r>
+        <w:t>Succ</w:t>
+      </w:r>
+      <w:proofErr w:type="spellEnd"/>
+      <w:r>
+        <w:t>(</w:t>
+      </w:r>
+      <w:proofErr w:type="spellStart"/>
+      <w:r>
+        <w:t>newCouche</w:t>
+      </w:r>
+      <w:proofErr w:type="spellEnd"/>
+      <w:r>
+        <w:t>)&lt;-</w:t>
+      </w:r>
+      <w:r>
+        <w:t>INDEFINI</w:t>
+      </w:r>
+      <w:r>
+        <w:br/>
+      </w:r>
+      <w:r>
+        <w:rPr>
+          <w:b/>
+          <w:bCs/>
+        </w:rPr>
+        <w:t xml:space="preserve">        </w:t>
+      </w:r>
+      <w:proofErr w:type="spellStart"/>
+      <w:r>
+        <w:t>Tmp</w:t>
+      </w:r>
+      <w:proofErr w:type="spellEnd"/>
+      <w:r>
+        <w:t xml:space="preserve"> &lt;- </w:t>
+      </w:r>
+      <w:proofErr w:type="spellStart"/>
+      <w:r>
+        <w:t>NewCouche</w:t>
+      </w:r>
+      <w:proofErr w:type="spellEnd"/>
+      <w:r>
+        <w:br/>
+      </w:r>
+      <w:r>
+        <w:rPr>
+          <w:b/>
+          <w:bCs/>
+        </w:rPr>
+        <w:t xml:space="preserve">    </w:t>
+      </w:r>
+      <w:r>
+        <w:rPr>
+          <w:b/>
+          <w:bCs/>
+        </w:rPr>
+        <w:t>Fin Pour</w:t>
+      </w:r>
+      <w:r>
+        <w:br/>
+      </w:r>
+      <w:r>
+        <w:rPr>
+          <w:b/>
+          <w:bCs/>
+        </w:rPr>
+        <w:t xml:space="preserve">    </w:t>
+      </w:r>
+      <w:proofErr w:type="spellStart"/>
+      <w:r>
+        <w:t>CreerResNeur</w:t>
+      </w:r>
+      <w:proofErr w:type="spellEnd"/>
+      <w:r>
+        <w:t xml:space="preserve"> &lt;- </w:t>
+      </w:r>
+      <w:proofErr w:type="spellStart"/>
+      <w:r>
+        <w:t>listeCouches</w:t>
+      </w:r>
+      <w:proofErr w:type="spellEnd"/>
+      <w:r>
+        <w:br/>
+      </w:r>
+      <w:r>
+        <w:rPr>
+          <w:b/>
+          <w:bCs/>
+        </w:rPr>
+        <w:t>Fin</w:t>
+      </w:r>
+    </w:p>
     <w:p/>
     <w:p>
       <w:pPr>
@@ -2642,7 +4134,6 @@
         </w:numPr>
       </w:pPr>
       <w:r>
-        <w:lastRenderedPageBreak/>
         <w:t>La sortie sera égale à 1, si toutes les entrées sont égales à 1 (car la somme doit être supérieure ou égale à n, pour dépasser le seuil), sinon elle vaut 0.</w:t>
       </w:r>
     </w:p>
@@ -2732,6 +4223,7 @@
     </w:p>
     <w:p>
       <w:r>
+        <w:lastRenderedPageBreak/>
         <w:t>Interprétation :</w:t>
       </w:r>
     </w:p>
@@ -2944,7 +4436,6 @@
         </w:numPr>
       </w:pPr>
       <w:r>
-        <w:lastRenderedPageBreak/>
         <w:t>Premier neurone (identité) avec une liste de poids égale à [1,0,0] et un seuil fixé à 1</w:t>
       </w:r>
     </w:p>
@@ -3015,6 +4506,7 @@
     </w:p>
     <w:p>
       <w:r>
+        <w:lastRenderedPageBreak/>
         <w:t>Troisième couche :</w:t>
       </w:r>
     </w:p>
@@ -3179,7 +4671,6 @@
     <w:p/>
     <w:p>
       <w:r>
-        <w:lastRenderedPageBreak/>
         <w:t>Essais :</w:t>
       </w:r>
     </w:p>
@@ -3203,6 +4694,7 @@
         <w:rPr>
           <w:noProof/>
         </w:rPr>
+        <w:lastRenderedPageBreak/>
         <w:drawing>
           <wp:anchor distT="0" distB="0" distL="114300" distR="114300" simplePos="0" relativeHeight="251658240" behindDoc="0" locked="0" layoutInCell="1" allowOverlap="1" wp14:anchorId="31615330" wp14:editId="3109C680">
             <wp:simplePos x="0" y="0"/>
@@ -3271,7 +4763,7 @@
 </file>
 
 <file path=word/endnotes.xml><?xml version="1.0" encoding="utf-8"?>
-<w:endnotes xmlns:wpc="http://schemas.microsoft.com/office/word/2010/wordprocessingCanvas" xmlns:cx="http://schemas.microsoft.com/office/drawing/2014/chartex" xmlns:cx1="http://schemas.microsoft.com/office/drawing/2015/9/8/chartex" xmlns:cx2="http://schemas.microsoft.com/office/drawing/2015/10/21/chartex" xmlns:cx3="http://schemas.microsoft.com/office/drawing/2016/5/9/chartex" xmlns:cx4="http://schemas.microsoft.com/office/drawing/2016/5/10/chartex" xmlns:cx5="http://schemas.microsoft.com/office/drawing/2016/5/11/chartex" xmlns:cx6="http://schemas.microsoft.com/office/drawing/2016/5/12/chartex" xmlns:cx7="http://schemas.microsoft.com/office/drawing/2016/5/13/chartex" xmlns:cx8="http://schemas.microsoft.com/office/drawing/2016/5/14/chartex" xmlns:mc="http://schemas.openxmlformats.org/markup-compatibility/2006" xmlns:aink="http://schemas.microsoft.com/office/drawing/2016/ink" xmlns:am3d="http://schemas.microsoft.com/office/drawing/2017/model3d" xmlns:o="urn:schemas-microsoft-com:office:office" xmlns:oel="http://schemas.microsoft.com/office/2019/extlst" xmlns:r="http://schemas.openxmlformats.org/officeDocument/2006/relationships" xmlns:m="http://schemas.openxmlformats.org/officeDocument/2006/math" xmlns:v="urn:schemas-microsoft-com:vml" xmlns:wp14="http://schemas.microsoft.com/office/word/2010/wordprocessingDrawing" xmlns:wp="http://schemas.openxmlformats.org/drawingml/2006/wordprocessingDrawing" xmlns:w10="urn:schemas-microsoft-com:office:word" xmlns:w="http://schemas.openxmlformats.org/wordprocessingml/2006/main" xmlns:w14="http://schemas.microsoft.com/office/word/2010/wordml" xmlns:w15="http://schemas.microsoft.com/office/word/2012/wordml" xmlns:w16cex="http://schemas.microsoft.com/office/word/2018/wordml/cex" xmlns:w16cid="http://schemas.microsoft.com/office/word/2016/wordml/cid" xmlns:w16="http://schemas.microsoft.com/office/word/2018/wordml" xmlns:w16du="http://schemas.microsoft.com/office/word/2023/wordml/word16du" xmlns:w16sdtdh="http://schemas.microsoft.com/office/word/2020/wordml/sdtdatahash" xmlns:w16se="http://schemas.microsoft.com/office/word/2015/wordml/symex" xmlns:wpg="http://schemas.microsoft.com/office/word/2010/wordprocessingGroup" xmlns:wpi="http://schemas.microsoft.com/office/word/2010/wordprocessingInk" xmlns:wne="http://schemas.microsoft.com/office/word/2006/wordml" xmlns:wps="http://schemas.microsoft.com/office/word/2010/wordprocessingShape" mc:Ignorable="w14 w15 w16se w16cid w16 w16cex w16sdtdh w16du wp14">
+<w:endnotes xmlns:wpc="http://schemas.microsoft.com/office/word/2010/wordprocessingCanvas" xmlns:cx="http://schemas.microsoft.com/office/drawing/2014/chartex" xmlns:cx1="http://schemas.microsoft.com/office/drawing/2015/9/8/chartex" xmlns:cx2="http://schemas.microsoft.com/office/drawing/2015/10/21/chartex" xmlns:cx3="http://schemas.microsoft.com/office/drawing/2016/5/9/chartex" xmlns:cx4="http://schemas.microsoft.com/office/drawing/2016/5/10/chartex" xmlns:cx5="http://schemas.microsoft.com/office/drawing/2016/5/11/chartex" xmlns:cx6="http://schemas.microsoft.com/office/drawing/2016/5/12/chartex" xmlns:cx7="http://schemas.microsoft.com/office/drawing/2016/5/13/chartex" xmlns:cx8="http://schemas.microsoft.com/office/drawing/2016/5/14/chartex" xmlns:mc="http://schemas.openxmlformats.org/markup-compatibility/2006" xmlns:aink="http://schemas.microsoft.com/office/drawing/2016/ink" xmlns:am3d="http://schemas.microsoft.com/office/drawing/2017/model3d" xmlns:o="urn:schemas-microsoft-com:office:office" xmlns:oel="http://schemas.microsoft.com/office/2019/extlst" xmlns:r="http://schemas.openxmlformats.org/officeDocument/2006/relationships" xmlns:m="http://schemas.openxmlformats.org/officeDocument/2006/math" xmlns:v="urn:schemas-microsoft-com:vml" xmlns:wp14="http://schemas.microsoft.com/office/word/2010/wordprocessingDrawing" xmlns:wp="http://schemas.openxmlformats.org/drawingml/2006/wordprocessingDrawing" xmlns:w10="urn:schemas-microsoft-com:office:word" xmlns:w="http://schemas.openxmlformats.org/wordprocessingml/2006/main" xmlns:w14="http://schemas.microsoft.com/office/word/2010/wordml" xmlns:w15="http://schemas.microsoft.com/office/word/2012/wordml" xmlns:w16cex="http://schemas.microsoft.com/office/word/2018/wordml/cex" xmlns:w16cid="http://schemas.microsoft.com/office/word/2016/wordml/cid" xmlns:w16="http://schemas.microsoft.com/office/word/2018/wordml" xmlns:w16du="http://schemas.microsoft.com/office/word/2023/wordml/word16du" xmlns:w16sdtdh="http://schemas.microsoft.com/office/word/2020/wordml/sdtdatahash" xmlns:w16sdtfl="http://schemas.microsoft.com/office/word/2024/wordml/sdtformatlock" xmlns:w16se="http://schemas.microsoft.com/office/word/2015/wordml/symex" xmlns:wpg="http://schemas.microsoft.com/office/word/2010/wordprocessingGroup" xmlns:wpi="http://schemas.microsoft.com/office/word/2010/wordprocessingInk" xmlns:wne="http://schemas.microsoft.com/office/word/2006/wordml" xmlns:wps="http://schemas.microsoft.com/office/word/2010/wordprocessingShape" mc:Ignorable="w14 w15 w16se w16cid w16 w16cex w16sdtdh w16sdtfl w16du wp14">
   <w:endnote w:type="separator" w:id="-1">
     <w:p>
       <w:pPr>
@@ -3296,7 +4788,7 @@
 </file>
 
 <file path=word/footer1.xml><?xml version="1.0" encoding="utf-8"?>
-<w:ftr xmlns:wpc="http://schemas.microsoft.com/office/word/2010/wordprocessingCanvas" xmlns:cx="http://schemas.microsoft.com/office/drawing/2014/chartex" xmlns:cx1="http://schemas.microsoft.com/office/drawing/2015/9/8/chartex" xmlns:cx2="http://schemas.microsoft.com/office/drawing/2015/10/21/chartex" xmlns:cx3="http://schemas.microsoft.com/office/drawing/2016/5/9/chartex" xmlns:cx4="http://schemas.microsoft.com/office/drawing/2016/5/10/chartex" xmlns:cx5="http://schemas.microsoft.com/office/drawing/2016/5/11/chartex" xmlns:cx6="http://schemas.microsoft.com/office/drawing/2016/5/12/chartex" xmlns:cx7="http://schemas.microsoft.com/office/drawing/2016/5/13/chartex" xmlns:cx8="http://schemas.microsoft.com/office/drawing/2016/5/14/chartex" xmlns:mc="http://schemas.openxmlformats.org/markup-compatibility/2006" xmlns:aink="http://schemas.microsoft.com/office/drawing/2016/ink" xmlns:am3d="http://schemas.microsoft.com/office/drawing/2017/model3d" xmlns:o="urn:schemas-microsoft-com:office:office" xmlns:oel="http://schemas.microsoft.com/office/2019/extlst" xmlns:r="http://schemas.openxmlformats.org/officeDocument/2006/relationships" xmlns:m="http://schemas.openxmlformats.org/officeDocument/2006/math" xmlns:v="urn:schemas-microsoft-com:vml" xmlns:wp14="http://schemas.microsoft.com/office/word/2010/wordprocessingDrawing" xmlns:wp="http://schemas.openxmlformats.org/drawingml/2006/wordprocessingDrawing" xmlns:w10="urn:schemas-microsoft-com:office:word" xmlns:w="http://schemas.openxmlformats.org/wordprocessingml/2006/main" xmlns:w14="http://schemas.microsoft.com/office/word/2010/wordml" xmlns:w15="http://schemas.microsoft.com/office/word/2012/wordml" xmlns:w16cex="http://schemas.microsoft.com/office/word/2018/wordml/cex" xmlns:w16cid="http://schemas.microsoft.com/office/word/2016/wordml/cid" xmlns:w16="http://schemas.microsoft.com/office/word/2018/wordml" xmlns:w16du="http://schemas.microsoft.com/office/word/2023/wordml/word16du" xmlns:w16sdtdh="http://schemas.microsoft.com/office/word/2020/wordml/sdtdatahash" xmlns:w16se="http://schemas.microsoft.com/office/word/2015/wordml/symex" xmlns:wpg="http://schemas.microsoft.com/office/word/2010/wordprocessingGroup" xmlns:wpi="http://schemas.microsoft.com/office/word/2010/wordprocessingInk" xmlns:wne="http://schemas.microsoft.com/office/word/2006/wordml" xmlns:wps="http://schemas.microsoft.com/office/word/2010/wordprocessingShape" mc:Ignorable="w14 w15 w16se w16cid w16 w16cex w16sdtdh w16du wp14">
+<w:ftr xmlns:wpc="http://schemas.microsoft.com/office/word/2010/wordprocessingCanvas" xmlns:cx="http://schemas.microsoft.com/office/drawing/2014/chartex" xmlns:cx1="http://schemas.microsoft.com/office/drawing/2015/9/8/chartex" xmlns:cx2="http://schemas.microsoft.com/office/drawing/2015/10/21/chartex" xmlns:cx3="http://schemas.microsoft.com/office/drawing/2016/5/9/chartex" xmlns:cx4="http://schemas.microsoft.com/office/drawing/2016/5/10/chartex" xmlns:cx5="http://schemas.microsoft.com/office/drawing/2016/5/11/chartex" xmlns:cx6="http://schemas.microsoft.com/office/drawing/2016/5/12/chartex" xmlns:cx7="http://schemas.microsoft.com/office/drawing/2016/5/13/chartex" xmlns:cx8="http://schemas.microsoft.com/office/drawing/2016/5/14/chartex" xmlns:mc="http://schemas.openxmlformats.org/markup-compatibility/2006" xmlns:aink="http://schemas.microsoft.com/office/drawing/2016/ink" xmlns:am3d="http://schemas.microsoft.com/office/drawing/2017/model3d" xmlns:o="urn:schemas-microsoft-com:office:office" xmlns:oel="http://schemas.microsoft.com/office/2019/extlst" xmlns:r="http://schemas.openxmlformats.org/officeDocument/2006/relationships" xmlns:m="http://schemas.openxmlformats.org/officeDocument/2006/math" xmlns:v="urn:schemas-microsoft-com:vml" xmlns:wp14="http://schemas.microsoft.com/office/word/2010/wordprocessingDrawing" xmlns:wp="http://schemas.openxmlformats.org/drawingml/2006/wordprocessingDrawing" xmlns:w10="urn:schemas-microsoft-com:office:word" xmlns:w="http://schemas.openxmlformats.org/wordprocessingml/2006/main" xmlns:w14="http://schemas.microsoft.com/office/word/2010/wordml" xmlns:w15="http://schemas.microsoft.com/office/word/2012/wordml" xmlns:w16cex="http://schemas.microsoft.com/office/word/2018/wordml/cex" xmlns:w16cid="http://schemas.microsoft.com/office/word/2016/wordml/cid" xmlns:w16="http://schemas.microsoft.com/office/word/2018/wordml" xmlns:w16du="http://schemas.microsoft.com/office/word/2023/wordml/word16du" xmlns:w16sdtdh="http://schemas.microsoft.com/office/word/2020/wordml/sdtdatahash" xmlns:w16sdtfl="http://schemas.microsoft.com/office/word/2024/wordml/sdtformatlock" xmlns:w16se="http://schemas.microsoft.com/office/word/2015/wordml/symex" xmlns:wpg="http://schemas.microsoft.com/office/word/2010/wordprocessingGroup" xmlns:wpi="http://schemas.microsoft.com/office/word/2010/wordprocessingInk" xmlns:wne="http://schemas.microsoft.com/office/word/2006/wordml" xmlns:wps="http://schemas.microsoft.com/office/word/2010/wordprocessingShape" mc:Ignorable="w14 w15 w16se w16cid w16 w16cex w16sdtdh w16sdtfl w16du wp14">
   <w:sdt>
     <w:sdtPr>
       <w:id w:val="1622334441"/>
@@ -3338,7 +4830,7 @@
 </file>
 
 <file path=word/footnotes.xml><?xml version="1.0" encoding="utf-8"?>
-<w:footnotes xmlns:wpc="http://schemas.microsoft.com/office/word/2010/wordprocessingCanvas" xmlns:cx="http://schemas.microsoft.com/office/drawing/2014/chartex" xmlns:cx1="http://schemas.microsoft.com/office/drawing/2015/9/8/chartex" xmlns:cx2="http://schemas.microsoft.com/office/drawing/2015/10/21/chartex" xmlns:cx3="http://schemas.microsoft.com/office/drawing/2016/5/9/chartex" xmlns:cx4="http://schemas.microsoft.com/office/drawing/2016/5/10/chartex" xmlns:cx5="http://schemas.microsoft.com/office/drawing/2016/5/11/chartex" xmlns:cx6="http://schemas.microsoft.com/office/drawing/2016/5/12/chartex" xmlns:cx7="http://schemas.microsoft.com/office/drawing/2016/5/13/chartex" xmlns:cx8="http://schemas.microsoft.com/office/drawing/2016/5/14/chartex" xmlns:mc="http://schemas.openxmlformats.org/markup-compatibility/2006" xmlns:aink="http://schemas.microsoft.com/office/drawing/2016/ink" xmlns:am3d="http://schemas.microsoft.com/office/drawing/2017/model3d" xmlns:o="urn:schemas-microsoft-com:office:office" xmlns:oel="http://schemas.microsoft.com/office/2019/extlst" xmlns:r="http://schemas.openxmlformats.org/officeDocument/2006/relationships" xmlns:m="http://schemas.openxmlformats.org/officeDocument/2006/math" xmlns:v="urn:schemas-microsoft-com:vml" xmlns:wp14="http://schemas.microsoft.com/office/word/2010/wordprocessingDrawing" xmlns:wp="http://schemas.openxmlformats.org/drawingml/2006/wordprocessingDrawing" xmlns:w10="urn:schemas-microsoft-com:office:word" xmlns:w="http://schemas.openxmlformats.org/wordprocessingml/2006/main" xmlns:w14="http://schemas.microsoft.com/office/word/2010/wordml" xmlns:w15="http://schemas.microsoft.com/office/word/2012/wordml" xmlns:w16cex="http://schemas.microsoft.com/office/word/2018/wordml/cex" xmlns:w16cid="http://schemas.microsoft.com/office/word/2016/wordml/cid" xmlns:w16="http://schemas.microsoft.com/office/word/2018/wordml" xmlns:w16du="http://schemas.microsoft.com/office/word/2023/wordml/word16du" xmlns:w16sdtdh="http://schemas.microsoft.com/office/word/2020/wordml/sdtdatahash" xmlns:w16se="http://schemas.microsoft.com/office/word/2015/wordml/symex" xmlns:wpg="http://schemas.microsoft.com/office/word/2010/wordprocessingGroup" xmlns:wpi="http://schemas.microsoft.com/office/word/2010/wordprocessingInk" xmlns:wne="http://schemas.microsoft.com/office/word/2006/wordml" xmlns:wps="http://schemas.microsoft.com/office/word/2010/wordprocessingShape" mc:Ignorable="w14 w15 w16se w16cid w16 w16cex w16sdtdh w16du wp14">
+<w:footnotes xmlns:wpc="http://schemas.microsoft.com/office/word/2010/wordprocessingCanvas" xmlns:cx="http://schemas.microsoft.com/office/drawing/2014/chartex" xmlns:cx1="http://schemas.microsoft.com/office/drawing/2015/9/8/chartex" xmlns:cx2="http://schemas.microsoft.com/office/drawing/2015/10/21/chartex" xmlns:cx3="http://schemas.microsoft.com/office/drawing/2016/5/9/chartex" xmlns:cx4="http://schemas.microsoft.com/office/drawing/2016/5/10/chartex" xmlns:cx5="http://schemas.microsoft.com/office/drawing/2016/5/11/chartex" xmlns:cx6="http://schemas.microsoft.com/office/drawing/2016/5/12/chartex" xmlns:cx7="http://schemas.microsoft.com/office/drawing/2016/5/13/chartex" xmlns:cx8="http://schemas.microsoft.com/office/drawing/2016/5/14/chartex" xmlns:mc="http://schemas.openxmlformats.org/markup-compatibility/2006" xmlns:aink="http://schemas.microsoft.com/office/drawing/2016/ink" xmlns:am3d="http://schemas.microsoft.com/office/drawing/2017/model3d" xmlns:o="urn:schemas-microsoft-com:office:office" xmlns:oel="http://schemas.microsoft.com/office/2019/extlst" xmlns:r="http://schemas.openxmlformats.org/officeDocument/2006/relationships" xmlns:m="http://schemas.openxmlformats.org/officeDocument/2006/math" xmlns:v="urn:schemas-microsoft-com:vml" xmlns:wp14="http://schemas.microsoft.com/office/word/2010/wordprocessingDrawing" xmlns:wp="http://schemas.openxmlformats.org/drawingml/2006/wordprocessingDrawing" xmlns:w10="urn:schemas-microsoft-com:office:word" xmlns:w="http://schemas.openxmlformats.org/wordprocessingml/2006/main" xmlns:w14="http://schemas.microsoft.com/office/word/2010/wordml" xmlns:w15="http://schemas.microsoft.com/office/word/2012/wordml" xmlns:w16cex="http://schemas.microsoft.com/office/word/2018/wordml/cex" xmlns:w16cid="http://schemas.microsoft.com/office/word/2016/wordml/cid" xmlns:w16="http://schemas.microsoft.com/office/word/2018/wordml" xmlns:w16du="http://schemas.microsoft.com/office/word/2023/wordml/word16du" xmlns:w16sdtdh="http://schemas.microsoft.com/office/word/2020/wordml/sdtdatahash" xmlns:w16sdtfl="http://schemas.microsoft.com/office/word/2024/wordml/sdtformatlock" xmlns:w16se="http://schemas.microsoft.com/office/word/2015/wordml/symex" xmlns:wpg="http://schemas.microsoft.com/office/word/2010/wordprocessingGroup" xmlns:wpi="http://schemas.microsoft.com/office/word/2010/wordprocessingInk" xmlns:wne="http://schemas.microsoft.com/office/word/2006/wordml" xmlns:wps="http://schemas.microsoft.com/office/word/2010/wordprocessingShape" mc:Ignorable="w14 w15 w16se w16cid w16 w16cex w16sdtdh w16sdtfl w16du wp14">
   <w:footnote w:type="separator" w:id="-1">
     <w:p>
       <w:pPr>
@@ -3363,7 +4855,7 @@
 </file>
 
 <file path=word/numbering.xml><?xml version="1.0" encoding="utf-8"?>
-<w:numbering xmlns:wpc="http://schemas.microsoft.com/office/word/2010/wordprocessingCanvas" xmlns:cx="http://schemas.microsoft.com/office/drawing/2014/chartex" xmlns:cx1="http://schemas.microsoft.com/office/drawing/2015/9/8/chartex" xmlns:cx2="http://schemas.microsoft.com/office/drawing/2015/10/21/chartex" xmlns:cx3="http://schemas.microsoft.com/office/drawing/2016/5/9/chartex" xmlns:cx4="http://schemas.microsoft.com/office/drawing/2016/5/10/chartex" xmlns:cx5="http://schemas.microsoft.com/office/drawing/2016/5/11/chartex" xmlns:cx6="http://schemas.microsoft.com/office/drawing/2016/5/12/chartex" xmlns:cx7="http://schemas.microsoft.com/office/drawing/2016/5/13/chartex" xmlns:cx8="http://schemas.microsoft.com/office/drawing/2016/5/14/chartex" xmlns:mc="http://schemas.openxmlformats.org/markup-compatibility/2006" xmlns:aink="http://schemas.microsoft.com/office/drawing/2016/ink" xmlns:am3d="http://schemas.microsoft.com/office/drawing/2017/model3d" xmlns:o="urn:schemas-microsoft-com:office:office" xmlns:oel="http://schemas.microsoft.com/office/2019/extlst" xmlns:r="http://schemas.openxmlformats.org/officeDocument/2006/relationships" xmlns:m="http://schemas.openxmlformats.org/officeDocument/2006/math" xmlns:v="urn:schemas-microsoft-com:vml" xmlns:wp14="http://schemas.microsoft.com/office/word/2010/wordprocessingDrawing" xmlns:wp="http://schemas.openxmlformats.org/drawingml/2006/wordprocessingDrawing" xmlns:w10="urn:schemas-microsoft-com:office:word" xmlns:w="http://schemas.openxmlformats.org/wordprocessingml/2006/main" xmlns:w14="http://schemas.microsoft.com/office/word/2010/wordml" xmlns:w15="http://schemas.microsoft.com/office/word/2012/wordml" xmlns:w16cex="http://schemas.microsoft.com/office/word/2018/wordml/cex" xmlns:w16cid="http://schemas.microsoft.com/office/word/2016/wordml/cid" xmlns:w16="http://schemas.microsoft.com/office/word/2018/wordml" xmlns:w16du="http://schemas.microsoft.com/office/word/2023/wordml/word16du" xmlns:w16sdtdh="http://schemas.microsoft.com/office/word/2020/wordml/sdtdatahash" xmlns:w16se="http://schemas.microsoft.com/office/word/2015/wordml/symex" xmlns:wpg="http://schemas.microsoft.com/office/word/2010/wordprocessingGroup" xmlns:wpi="http://schemas.microsoft.com/office/word/2010/wordprocessingInk" xmlns:wne="http://schemas.microsoft.com/office/word/2006/wordml" xmlns:wps="http://schemas.microsoft.com/office/word/2010/wordprocessingShape" mc:Ignorable="w14 w15 w16se w16cid w16 w16cex w16sdtdh w16du wp14">
+<w:numbering xmlns:wpc="http://schemas.microsoft.com/office/word/2010/wordprocessingCanvas" xmlns:cx="http://schemas.microsoft.com/office/drawing/2014/chartex" xmlns:cx1="http://schemas.microsoft.com/office/drawing/2015/9/8/chartex" xmlns:cx2="http://schemas.microsoft.com/office/drawing/2015/10/21/chartex" xmlns:cx3="http://schemas.microsoft.com/office/drawing/2016/5/9/chartex" xmlns:cx4="http://schemas.microsoft.com/office/drawing/2016/5/10/chartex" xmlns:cx5="http://schemas.microsoft.com/office/drawing/2016/5/11/chartex" xmlns:cx6="http://schemas.microsoft.com/office/drawing/2016/5/12/chartex" xmlns:cx7="http://schemas.microsoft.com/office/drawing/2016/5/13/chartex" xmlns:cx8="http://schemas.microsoft.com/office/drawing/2016/5/14/chartex" xmlns:mc="http://schemas.openxmlformats.org/markup-compatibility/2006" xmlns:aink="http://schemas.microsoft.com/office/drawing/2016/ink" xmlns:am3d="http://schemas.microsoft.com/office/drawing/2017/model3d" xmlns:o="urn:schemas-microsoft-com:office:office" xmlns:oel="http://schemas.microsoft.com/office/2019/extlst" xmlns:r="http://schemas.openxmlformats.org/officeDocument/2006/relationships" xmlns:m="http://schemas.openxmlformats.org/officeDocument/2006/math" xmlns:v="urn:schemas-microsoft-com:vml" xmlns:wp14="http://schemas.microsoft.com/office/word/2010/wordprocessingDrawing" xmlns:wp="http://schemas.openxmlformats.org/drawingml/2006/wordprocessingDrawing" xmlns:w10="urn:schemas-microsoft-com:office:word" xmlns:w="http://schemas.openxmlformats.org/wordprocessingml/2006/main" xmlns:w14="http://schemas.microsoft.com/office/word/2010/wordml" xmlns:w15="http://schemas.microsoft.com/office/word/2012/wordml" xmlns:w16cex="http://schemas.microsoft.com/office/word/2018/wordml/cex" xmlns:w16cid="http://schemas.microsoft.com/office/word/2016/wordml/cid" xmlns:w16="http://schemas.microsoft.com/office/word/2018/wordml" xmlns:w16du="http://schemas.microsoft.com/office/word/2023/wordml/word16du" xmlns:w16sdtdh="http://schemas.microsoft.com/office/word/2020/wordml/sdtdatahash" xmlns:w16sdtfl="http://schemas.microsoft.com/office/word/2024/wordml/sdtformatlock" xmlns:w16se="http://schemas.microsoft.com/office/word/2015/wordml/symex" xmlns:wpg="http://schemas.microsoft.com/office/word/2010/wordprocessingGroup" xmlns:wpi="http://schemas.microsoft.com/office/word/2010/wordprocessingInk" xmlns:wne="http://schemas.microsoft.com/office/word/2006/wordml" xmlns:wps="http://schemas.microsoft.com/office/word/2010/wordprocessingShape" mc:Ignorable="w14 w15 w16se w16cid w16 w16cex w16sdtdh w16sdtfl w16du wp14">
   <w:abstractNum w:abstractNumId="0" w15:restartNumberingAfterBreak="0">
     <w:nsid w:val="0D360BA6"/>
     <w:multiLevelType w:val="hybridMultilevel"/>
@@ -6092,7 +7584,7 @@
 </file>
 
 <file path=word/styles.xml><?xml version="1.0" encoding="utf-8"?>
-<w:styles xmlns:mc="http://schemas.openxmlformats.org/markup-compatibility/2006" xmlns:r="http://schemas.openxmlformats.org/officeDocument/2006/relationships" xmlns:w="http://schemas.openxmlformats.org/wordprocessingml/2006/main" xmlns:w14="http://schemas.microsoft.com/office/word/2010/wordml" xmlns:w15="http://schemas.microsoft.com/office/word/2012/wordml" xmlns:w16cex="http://schemas.microsoft.com/office/word/2018/wordml/cex" xmlns:w16cid="http://schemas.microsoft.com/office/word/2016/wordml/cid" xmlns:w16="http://schemas.microsoft.com/office/word/2018/wordml" xmlns:w16du="http://schemas.microsoft.com/office/word/2023/wordml/word16du" xmlns:w16sdtdh="http://schemas.microsoft.com/office/word/2020/wordml/sdtdatahash" xmlns:w16se="http://schemas.microsoft.com/office/word/2015/wordml/symex" mc:Ignorable="w14 w15 w16se w16cid w16 w16cex w16sdtdh w16du">
+<w:styles xmlns:mc="http://schemas.openxmlformats.org/markup-compatibility/2006" xmlns:r="http://schemas.openxmlformats.org/officeDocument/2006/relationships" xmlns:w="http://schemas.openxmlformats.org/wordprocessingml/2006/main" xmlns:w14="http://schemas.microsoft.com/office/word/2010/wordml" xmlns:w15="http://schemas.microsoft.com/office/word/2012/wordml" xmlns:w16cex="http://schemas.microsoft.com/office/word/2018/wordml/cex" xmlns:w16cid="http://schemas.microsoft.com/office/word/2016/wordml/cid" xmlns:w16="http://schemas.microsoft.com/office/word/2018/wordml" xmlns:w16du="http://schemas.microsoft.com/office/word/2023/wordml/word16du" xmlns:w16sdtdh="http://schemas.microsoft.com/office/word/2020/wordml/sdtdatahash" xmlns:w16sdtfl="http://schemas.microsoft.com/office/word/2024/wordml/sdtformatlock" xmlns:w16se="http://schemas.microsoft.com/office/word/2015/wordml/symex" mc:Ignorable="w14 w15 w16se w16cid w16 w16cex w16sdtdh w16sdtfl w16du">
   <w:docDefaults>
     <w:rPrDefault>
       <w:rPr>
@@ -6692,7 +8184,6 @@
   <w:style w:type="character" w:default="1" w:styleId="Policepardfaut">
     <w:name w:val="Default Paragraph Font"/>
     <w:uiPriority w:val="1"/>
-    <w:semiHidden/>
     <w:unhideWhenUsed/>
   </w:style>
   <w:style w:type="table" w:default="1" w:styleId="TableauNormal">
@@ -7217,7 +8708,7 @@
 </file>
 
 <file path=word/glossary/document.xml><?xml version="1.0" encoding="utf-8"?>
-<w:glossaryDocument xmlns:wpc="http://schemas.microsoft.com/office/word/2010/wordprocessingCanvas" xmlns:cx="http://schemas.microsoft.com/office/drawing/2014/chartex" xmlns:cx1="http://schemas.microsoft.com/office/drawing/2015/9/8/chartex" xmlns:cx2="http://schemas.microsoft.com/office/drawing/2015/10/21/chartex" xmlns:cx3="http://schemas.microsoft.com/office/drawing/2016/5/9/chartex" xmlns:cx4="http://schemas.microsoft.com/office/drawing/2016/5/10/chartex" xmlns:cx5="http://schemas.microsoft.com/office/drawing/2016/5/11/chartex" xmlns:cx6="http://schemas.microsoft.com/office/drawing/2016/5/12/chartex" xmlns:cx7="http://schemas.microsoft.com/office/drawing/2016/5/13/chartex" xmlns:cx8="http://schemas.microsoft.com/office/drawing/2016/5/14/chartex" xmlns:mc="http://schemas.openxmlformats.org/markup-compatibility/2006" xmlns:aink="http://schemas.microsoft.com/office/drawing/2016/ink" xmlns:am3d="http://schemas.microsoft.com/office/drawing/2017/model3d" xmlns:o="urn:schemas-microsoft-com:office:office" xmlns:oel="http://schemas.microsoft.com/office/2019/extlst" xmlns:r="http://schemas.openxmlformats.org/officeDocument/2006/relationships" xmlns:m="http://schemas.openxmlformats.org/officeDocument/2006/math" xmlns:v="urn:schemas-microsoft-com:vml" xmlns:wp14="http://schemas.microsoft.com/office/word/2010/wordprocessingDrawing" xmlns:wp="http://schemas.openxmlformats.org/drawingml/2006/wordprocessingDrawing" xmlns:w10="urn:schemas-microsoft-com:office:word" xmlns:w="http://schemas.openxmlformats.org/wordprocessingml/2006/main" xmlns:w14="http://schemas.microsoft.com/office/word/2010/wordml" xmlns:w15="http://schemas.microsoft.com/office/word/2012/wordml" xmlns:w16cex="http://schemas.microsoft.com/office/word/2018/wordml/cex" xmlns:w16cid="http://schemas.microsoft.com/office/word/2016/wordml/cid" xmlns:w16="http://schemas.microsoft.com/office/word/2018/wordml" xmlns:w16du="http://schemas.microsoft.com/office/word/2023/wordml/word16du" xmlns:w16sdtdh="http://schemas.microsoft.com/office/word/2020/wordml/sdtdatahash" xmlns:w16se="http://schemas.microsoft.com/office/word/2015/wordml/symex" xmlns:wpg="http://schemas.microsoft.com/office/word/2010/wordprocessingGroup" xmlns:wpi="http://schemas.microsoft.com/office/word/2010/wordprocessingInk" xmlns:wne="http://schemas.microsoft.com/office/word/2006/wordml" xmlns:wps="http://schemas.microsoft.com/office/word/2010/wordprocessingShape" mc:Ignorable="w14 w15 w16se w16cid w16 w16cex w16sdtdh w16du wp14">
+<w:glossaryDocument xmlns:wpc="http://schemas.microsoft.com/office/word/2010/wordprocessingCanvas" xmlns:cx="http://schemas.microsoft.com/office/drawing/2014/chartex" xmlns:cx1="http://schemas.microsoft.com/office/drawing/2015/9/8/chartex" xmlns:cx2="http://schemas.microsoft.com/office/drawing/2015/10/21/chartex" xmlns:cx3="http://schemas.microsoft.com/office/drawing/2016/5/9/chartex" xmlns:cx4="http://schemas.microsoft.com/office/drawing/2016/5/10/chartex" xmlns:cx5="http://schemas.microsoft.com/office/drawing/2016/5/11/chartex" xmlns:cx6="http://schemas.microsoft.com/office/drawing/2016/5/12/chartex" xmlns:cx7="http://schemas.microsoft.com/office/drawing/2016/5/13/chartex" xmlns:cx8="http://schemas.microsoft.com/office/drawing/2016/5/14/chartex" xmlns:mc="http://schemas.openxmlformats.org/markup-compatibility/2006" xmlns:aink="http://schemas.microsoft.com/office/drawing/2016/ink" xmlns:am3d="http://schemas.microsoft.com/office/drawing/2017/model3d" xmlns:o="urn:schemas-microsoft-com:office:office" xmlns:oel="http://schemas.microsoft.com/office/2019/extlst" xmlns:r="http://schemas.openxmlformats.org/officeDocument/2006/relationships" xmlns:m="http://schemas.openxmlformats.org/officeDocument/2006/math" xmlns:v="urn:schemas-microsoft-com:vml" xmlns:wp14="http://schemas.microsoft.com/office/word/2010/wordprocessingDrawing" xmlns:wp="http://schemas.openxmlformats.org/drawingml/2006/wordprocessingDrawing" xmlns:w10="urn:schemas-microsoft-com:office:word" xmlns:w="http://schemas.openxmlformats.org/wordprocessingml/2006/main" xmlns:w14="http://schemas.microsoft.com/office/word/2010/wordml" xmlns:w15="http://schemas.microsoft.com/office/word/2012/wordml" xmlns:w16cex="http://schemas.microsoft.com/office/word/2018/wordml/cex" xmlns:w16cid="http://schemas.microsoft.com/office/word/2016/wordml/cid" xmlns:w16="http://schemas.microsoft.com/office/word/2018/wordml" xmlns:w16du="http://schemas.microsoft.com/office/word/2023/wordml/word16du" xmlns:w16sdtdh="http://schemas.microsoft.com/office/word/2020/wordml/sdtdatahash" xmlns:w16sdtfl="http://schemas.microsoft.com/office/word/2024/wordml/sdtformatlock" xmlns:w16se="http://schemas.microsoft.com/office/word/2015/wordml/symex" xmlns:wpg="http://schemas.microsoft.com/office/word/2010/wordprocessingGroup" xmlns:wpi="http://schemas.microsoft.com/office/word/2010/wordprocessingInk" xmlns:wne="http://schemas.microsoft.com/office/word/2006/wordml" xmlns:wps="http://schemas.microsoft.com/office/word/2010/wordprocessingShape" mc:Ignorable="w14 w15 w16se w16cid w16 w16cex w16sdtdh w16sdtfl w16du wp14">
   <w:docParts>
     <w:docPart>
       <w:docPartPr>
@@ -7345,7 +8836,7 @@
 </file>
 
 <file path=word/glossary/fontTable.xml><?xml version="1.0" encoding="utf-8"?>
-<w:fonts xmlns:mc="http://schemas.openxmlformats.org/markup-compatibility/2006" xmlns:r="http://schemas.openxmlformats.org/officeDocument/2006/relationships" xmlns:w="http://schemas.openxmlformats.org/wordprocessingml/2006/main" xmlns:w14="http://schemas.microsoft.com/office/word/2010/wordml" xmlns:w15="http://schemas.microsoft.com/office/word/2012/wordml" xmlns:w16cex="http://schemas.microsoft.com/office/word/2018/wordml/cex" xmlns:w16cid="http://schemas.microsoft.com/office/word/2016/wordml/cid" xmlns:w16="http://schemas.microsoft.com/office/word/2018/wordml" xmlns:w16du="http://schemas.microsoft.com/office/word/2023/wordml/word16du" xmlns:w16sdtdh="http://schemas.microsoft.com/office/word/2020/wordml/sdtdatahash" xmlns:w16se="http://schemas.microsoft.com/office/word/2015/wordml/symex" mc:Ignorable="w14 w15 w16se w16cid w16 w16cex w16sdtdh w16du">
+<w:fonts xmlns:mc="http://schemas.openxmlformats.org/markup-compatibility/2006" xmlns:r="http://schemas.openxmlformats.org/officeDocument/2006/relationships" xmlns:w="http://schemas.openxmlformats.org/wordprocessingml/2006/main" xmlns:w14="http://schemas.microsoft.com/office/word/2010/wordml" xmlns:w15="http://schemas.microsoft.com/office/word/2012/wordml" xmlns:w16cex="http://schemas.microsoft.com/office/word/2018/wordml/cex" xmlns:w16cid="http://schemas.microsoft.com/office/word/2016/wordml/cid" xmlns:w16="http://schemas.microsoft.com/office/word/2018/wordml" xmlns:w16du="http://schemas.microsoft.com/office/word/2023/wordml/word16du" xmlns:w16sdtdh="http://schemas.microsoft.com/office/word/2020/wordml/sdtdatahash" xmlns:w16sdtfl="http://schemas.microsoft.com/office/word/2024/wordml/sdtformatlock" xmlns:w16se="http://schemas.microsoft.com/office/word/2015/wordml/symex" mc:Ignorable="w14 w15 w16se w16cid w16 w16cex w16sdtdh w16sdtfl w16du">
   <w:font w:name="Aptos">
     <w:charset w:val="00"/>
     <w:family w:val="swiss"/>
@@ -7390,7 +8881,7 @@
 </file>
 
 <file path=word/glossary/settings.xml><?xml version="1.0" encoding="utf-8"?>
-<w:settings xmlns:mc="http://schemas.openxmlformats.org/markup-compatibility/2006" xmlns:o="urn:schemas-microsoft-com:office:office" xmlns:r="http://schemas.openxmlformats.org/officeDocument/2006/relationships" xmlns:m="http://schemas.openxmlformats.org/officeDocument/2006/math" xmlns:v="urn:schemas-microsoft-com:vml" xmlns:w10="urn:schemas-microsoft-com:office:word" xmlns:w="http://schemas.openxmlformats.org/wordprocessingml/2006/main" xmlns:w14="http://schemas.microsoft.com/office/word/2010/wordml" xmlns:w15="http://schemas.microsoft.com/office/word/2012/wordml" xmlns:w16cex="http://schemas.microsoft.com/office/word/2018/wordml/cex" xmlns:w16cid="http://schemas.microsoft.com/office/word/2016/wordml/cid" xmlns:w16="http://schemas.microsoft.com/office/word/2018/wordml" xmlns:w16du="http://schemas.microsoft.com/office/word/2023/wordml/word16du" xmlns:w16sdtdh="http://schemas.microsoft.com/office/word/2020/wordml/sdtdatahash" xmlns:w16se="http://schemas.microsoft.com/office/word/2015/wordml/symex" xmlns:sl="http://schemas.openxmlformats.org/schemaLibrary/2006/main" mc:Ignorable="w14 w15 w16se w16cid w16 w16cex w16sdtdh w16du">
+<w:settings xmlns:mc="http://schemas.openxmlformats.org/markup-compatibility/2006" xmlns:o="urn:schemas-microsoft-com:office:office" xmlns:r="http://schemas.openxmlformats.org/officeDocument/2006/relationships" xmlns:m="http://schemas.openxmlformats.org/officeDocument/2006/math" xmlns:v="urn:schemas-microsoft-com:vml" xmlns:w10="urn:schemas-microsoft-com:office:word" xmlns:w="http://schemas.openxmlformats.org/wordprocessingml/2006/main" xmlns:w14="http://schemas.microsoft.com/office/word/2010/wordml" xmlns:w15="http://schemas.microsoft.com/office/word/2012/wordml" xmlns:w16cex="http://schemas.microsoft.com/office/word/2018/wordml/cex" xmlns:w16cid="http://schemas.microsoft.com/office/word/2016/wordml/cid" xmlns:w16="http://schemas.microsoft.com/office/word/2018/wordml" xmlns:w16du="http://schemas.microsoft.com/office/word/2023/wordml/word16du" xmlns:w16sdtdh="http://schemas.microsoft.com/office/word/2020/wordml/sdtdatahash" xmlns:w16sdtfl="http://schemas.microsoft.com/office/word/2024/wordml/sdtformatlock" xmlns:w16se="http://schemas.microsoft.com/office/word/2015/wordml/symex" xmlns:sl="http://schemas.openxmlformats.org/schemaLibrary/2006/main" mc:Ignorable="w14 w15 w16se w16cid w16 w16cex w16sdtdh w16sdtfl w16du">
   <w:view w:val="normal"/>
   <w:defaultTabStop w:val="708"/>
   <w:hyphenationZone w:val="425"/>
@@ -7413,7 +8904,9 @@
     <w:rsid w:val="00180CED"/>
     <w:rsid w:val="001F41DD"/>
     <w:rsid w:val="002030CA"/>
+    <w:rsid w:val="00235B1D"/>
     <w:rsid w:val="003B7B5A"/>
+    <w:rsid w:val="00467C6E"/>
     <w:rsid w:val="00535A86"/>
     <w:rsid w:val="007217F5"/>
     <w:rsid w:val="00757A89"/>
@@ -7421,6 +8914,7 @@
     <w:rsid w:val="00793A24"/>
     <w:rsid w:val="00807545"/>
     <w:rsid w:val="008B7CFE"/>
+    <w:rsid w:val="00970344"/>
     <w:rsid w:val="009874E3"/>
     <w:rsid w:val="00A2508A"/>
     <w:rsid w:val="00B019CE"/>
@@ -7429,6 +8923,7 @@
     <w:rsid w:val="00BF0B45"/>
     <w:rsid w:val="00C32169"/>
     <w:rsid w:val="00D07A74"/>
+    <w:rsid w:val="00D74A36"/>
     <w:rsid w:val="00D95E71"/>
     <w:rsid w:val="00EB0DEB"/>
     <w:rsid w:val="00EB251E"/>
@@ -7459,7 +8954,7 @@
 </file>
 
 <file path=word/glossary/styles.xml><?xml version="1.0" encoding="utf-8"?>
-<w:styles xmlns:mc="http://schemas.openxmlformats.org/markup-compatibility/2006" xmlns:r="http://schemas.openxmlformats.org/officeDocument/2006/relationships" xmlns:w="http://schemas.openxmlformats.org/wordprocessingml/2006/main" xmlns:w14="http://schemas.microsoft.com/office/word/2010/wordml" xmlns:w15="http://schemas.microsoft.com/office/word/2012/wordml" xmlns:w16cex="http://schemas.microsoft.com/office/word/2018/wordml/cex" xmlns:w16cid="http://schemas.microsoft.com/office/word/2016/wordml/cid" xmlns:w16="http://schemas.microsoft.com/office/word/2018/wordml" xmlns:w16du="http://schemas.microsoft.com/office/word/2023/wordml/word16du" xmlns:w16sdtdh="http://schemas.microsoft.com/office/word/2020/wordml/sdtdatahash" xmlns:w16se="http://schemas.microsoft.com/office/word/2015/wordml/symex" mc:Ignorable="w14 w15 w16se w16cid w16 w16cex w16sdtdh w16du">
+<w:styles xmlns:mc="http://schemas.openxmlformats.org/markup-compatibility/2006" xmlns:r="http://schemas.openxmlformats.org/officeDocument/2006/relationships" xmlns:w="http://schemas.openxmlformats.org/wordprocessingml/2006/main" xmlns:w14="http://schemas.microsoft.com/office/word/2010/wordml" xmlns:w15="http://schemas.microsoft.com/office/word/2012/wordml" xmlns:w16cex="http://schemas.microsoft.com/office/word/2018/wordml/cex" xmlns:w16cid="http://schemas.microsoft.com/office/word/2016/wordml/cid" xmlns:w16="http://schemas.microsoft.com/office/word/2018/wordml" xmlns:w16du="http://schemas.microsoft.com/office/word/2023/wordml/word16du" xmlns:w16sdtdh="http://schemas.microsoft.com/office/word/2020/wordml/sdtdatahash" xmlns:w16sdtfl="http://schemas.microsoft.com/office/word/2024/wordml/sdtformatlock" xmlns:w16se="http://schemas.microsoft.com/office/word/2015/wordml/symex" mc:Ignorable="w14 w15 w16se w16cid w16 w16cex w16sdtdh w16sdtfl w16du">
   <w:docDefaults>
     <w:rPrDefault>
       <w:rPr>
@@ -7906,7 +9401,7 @@
 </file>
 
 <file path=word/glossary/webSettings.xml><?xml version="1.0" encoding="utf-8"?>
-<w:webSettings xmlns:mc="http://schemas.openxmlformats.org/markup-compatibility/2006" xmlns:r="http://schemas.openxmlformats.org/officeDocument/2006/relationships" xmlns:w="http://schemas.openxmlformats.org/wordprocessingml/2006/main" xmlns:w14="http://schemas.microsoft.com/office/word/2010/wordml" xmlns:w15="http://schemas.microsoft.com/office/word/2012/wordml" xmlns:w16cex="http://schemas.microsoft.com/office/word/2018/wordml/cex" xmlns:w16cid="http://schemas.microsoft.com/office/word/2016/wordml/cid" xmlns:w16="http://schemas.microsoft.com/office/word/2018/wordml" xmlns:w16du="http://schemas.microsoft.com/office/word/2023/wordml/word16du" xmlns:w16sdtdh="http://schemas.microsoft.com/office/word/2020/wordml/sdtdatahash" xmlns:w16se="http://schemas.microsoft.com/office/word/2015/wordml/symex" mc:Ignorable="w14 w15 w16se w16cid w16 w16cex w16sdtdh w16du">
+<w:webSettings xmlns:mc="http://schemas.openxmlformats.org/markup-compatibility/2006" xmlns:r="http://schemas.openxmlformats.org/officeDocument/2006/relationships" xmlns:w="http://schemas.openxmlformats.org/wordprocessingml/2006/main" xmlns:w14="http://schemas.microsoft.com/office/word/2010/wordml" xmlns:w15="http://schemas.microsoft.com/office/word/2012/wordml" xmlns:w16cex="http://schemas.microsoft.com/office/word/2018/wordml/cex" xmlns:w16cid="http://schemas.microsoft.com/office/word/2016/wordml/cid" xmlns:w16="http://schemas.microsoft.com/office/word/2018/wordml" xmlns:w16du="http://schemas.microsoft.com/office/word/2023/wordml/word16du" xmlns:w16sdtdh="http://schemas.microsoft.com/office/word/2020/wordml/sdtdatahash" xmlns:w16sdtfl="http://schemas.microsoft.com/office/word/2024/wordml/sdtformatlock" xmlns:w16se="http://schemas.microsoft.com/office/word/2015/wordml/symex" mc:Ignorable="w14 w15 w16se w16cid w16 w16cex w16sdtdh w16sdtfl w16du">
   <w:optimizeForBrowser/>
   <w:allowPNG/>
 </w:webSettings>

</xml_diff>

<commit_message>
La ca deconne plus
</commit_message>
<xml_diff>
--- a/Rapport.docx
+++ b/Rapport.docx
@@ -3659,13 +3659,7 @@
         <w:t>Pour</w:t>
       </w:r>
       <w:r>
-        <w:t xml:space="preserve"> i allant de 0 à nbCouche</w:t>
-      </w:r>
-      <w:r>
-        <w:t>-1</w:t>
-      </w:r>
-      <w:r>
-        <w:t xml:space="preserve"> </w:t>
+        <w:t xml:space="preserve"> i allant de 0 à nbCouche-1 </w:t>
       </w:r>
       <w:r>
         <w:rPr>
@@ -3950,10 +3944,7 @@
       </w:r>
       <w:proofErr w:type="spellEnd"/>
       <w:r>
-        <w:t>)&lt;-</w:t>
-      </w:r>
-      <w:r>
-        <w:t>INDEFINI</w:t>
+        <w:t>)&lt;-INDEFINI</w:t>
       </w:r>
       <w:r>
         <w:br/>
@@ -4047,10 +4038,377 @@
       <w:proofErr w:type="spellEnd"/>
     </w:p>
     <w:p>
-      <w:r>
+      <w:pPr>
+        <w:rPr>
+          <w:b/>
+          <w:bCs/>
+        </w:rPr>
+      </w:pPr>
+      <w:r>
+        <w:rPr>
+          <w:b/>
+          <w:bCs/>
+        </w:rPr>
+        <w:t xml:space="preserve">Procédure </w:t>
+      </w:r>
+      <w:proofErr w:type="spellStart"/>
+      <w:r>
+        <w:rPr>
+          <w:b/>
+          <w:bCs/>
+        </w:rPr>
+        <w:t>PropagationAvant</w:t>
+      </w:r>
+      <w:proofErr w:type="spellEnd"/>
+      <w:r>
+        <w:rPr>
+          <w:b/>
+          <w:bCs/>
+        </w:rPr>
+        <w:t>(</w:t>
+      </w:r>
+      <w:proofErr w:type="spellStart"/>
+      <w:r>
+        <w:rPr>
+          <w:b/>
+          <w:bCs/>
+        </w:rPr>
+        <w:t>reseau</w:t>
+      </w:r>
+      <w:proofErr w:type="spellEnd"/>
+      <w:r>
+        <w:rPr>
+          <w:b/>
+          <w:bCs/>
+        </w:rPr>
+        <w:t xml:space="preserve"> : Couche, </w:t>
+      </w:r>
+      <w:proofErr w:type="spellStart"/>
+      <w:r>
+        <w:rPr>
+          <w:b/>
+          <w:bCs/>
+        </w:rPr>
+        <w:t>listeEntrees</w:t>
+      </w:r>
+      <w:proofErr w:type="spellEnd"/>
+      <w:r>
+        <w:rPr>
+          <w:b/>
+          <w:bCs/>
+        </w:rPr>
+        <w:t>[] : Tableau d’entier)</w:t>
+      </w:r>
+      <w:r>
+        <w:rPr>
+          <w:b/>
+          <w:bCs/>
+        </w:rPr>
         <w:br/>
+        <w:t>Début</w:t>
+      </w:r>
+      <w:r>
+        <w:rPr>
+          <w:b/>
+          <w:bCs/>
+        </w:rPr>
+        <w:br/>
+      </w:r>
+      <w:r>
+        <w:t xml:space="preserve">    </w:t>
+      </w:r>
+      <w:proofErr w:type="spellStart"/>
+      <w:r>
+        <w:t>premiere_couche</w:t>
+      </w:r>
+      <w:proofErr w:type="spellEnd"/>
+      <w:r>
+        <w:t xml:space="preserve"> : Couche  &lt;- </w:t>
+      </w:r>
+      <w:proofErr w:type="spellStart"/>
+      <w:r>
+        <w:t>reseau</w:t>
+      </w:r>
+      <w:proofErr w:type="spellEnd"/>
+      <w:r>
+        <w:br/>
+        <w:t xml:space="preserve">    </w:t>
+      </w:r>
+      <w:proofErr w:type="spellStart"/>
+      <w:r>
+        <w:t>listeSortiesNeuronesPrev</w:t>
+      </w:r>
+      <w:proofErr w:type="spellEnd"/>
+      <w:r>
+        <w:t xml:space="preserve"> : Liste d’entiers &lt;- </w:t>
+      </w:r>
+      <w:proofErr w:type="spellStart"/>
+      <w:r>
+        <w:t>créerListeVide</w:t>
+      </w:r>
+      <w:proofErr w:type="spellEnd"/>
+      <w:r>
+        <w:t>()</w:t>
+      </w:r>
+      <w:r>
+        <w:br/>
+        <w:t xml:space="preserve">    OutCouche(premiere_couche,listeEntrees,listeSortiesNeureonesPrev)            </w:t>
+      </w:r>
+      <w:r>
+        <w:br/>
+        <w:t xml:space="preserve">    couche : Couche &lt;- </w:t>
+      </w:r>
+      <w:proofErr w:type="spellStart"/>
+      <w:r>
+        <w:t>succ</w:t>
+      </w:r>
+      <w:proofErr w:type="spellEnd"/>
+      <w:r>
+        <w:t>(</w:t>
+      </w:r>
+      <w:proofErr w:type="spellStart"/>
+      <w:r>
+        <w:t>premiere_couche</w:t>
+      </w:r>
+      <w:proofErr w:type="spellEnd"/>
+      <w:r>
+        <w:t xml:space="preserve">) </w:t>
+      </w:r>
+      <w:r>
+        <w:br/>
+        <w:t xml:space="preserve">    </w:t>
+      </w:r>
+      <w:r>
+        <w:rPr>
+          <w:b/>
+          <w:bCs/>
+        </w:rPr>
+        <w:t>Tant que</w:t>
+      </w:r>
+      <w:r>
+        <w:t xml:space="preserve">  </w:t>
+      </w:r>
+      <w:proofErr w:type="spellStart"/>
+      <w:r>
+        <w:t>NonVide</w:t>
+      </w:r>
+      <w:proofErr w:type="spellEnd"/>
+      <w:r>
+        <w:t xml:space="preserve">(couche) </w:t>
+      </w:r>
+      <w:r>
+        <w:rPr>
+          <w:b/>
+          <w:bCs/>
+        </w:rPr>
+        <w:t>faire</w:t>
+      </w:r>
+      <w:r>
+        <w:rPr>
+          <w:b/>
+          <w:bCs/>
+        </w:rPr>
+        <w:br/>
+      </w:r>
+      <w:r>
+        <w:t xml:space="preserve">        </w:t>
+      </w:r>
+      <w:proofErr w:type="spellStart"/>
+      <w:r>
+        <w:t>listeSortiesNeurones</w:t>
+      </w:r>
+      <w:proofErr w:type="spellEnd"/>
+      <w:r>
+        <w:t xml:space="preserve"> : Liste d’entiers &lt;- </w:t>
+      </w:r>
+      <w:proofErr w:type="spellStart"/>
+      <w:r>
+        <w:t>créerListeVide</w:t>
+      </w:r>
+      <w:proofErr w:type="spellEnd"/>
+      <w:r>
+        <w:t>()</w:t>
+      </w:r>
+      <w:r>
+        <w:br/>
+        <w:t xml:space="preserve">        </w:t>
+      </w:r>
+      <w:proofErr w:type="spellStart"/>
+      <w:r>
+        <w:t>OutCouche</w:t>
+      </w:r>
+      <w:proofErr w:type="spellEnd"/>
+      <w:r>
+        <w:t xml:space="preserve">(couche, </w:t>
+      </w:r>
+      <w:proofErr w:type="spellStart"/>
+      <w:r>
+        <w:t>listeSortiesNeureonesPrev</w:t>
+      </w:r>
+      <w:proofErr w:type="spellEnd"/>
+      <w:r>
+        <w:t xml:space="preserve"> ,</w:t>
+      </w:r>
+      <w:proofErr w:type="spellStart"/>
+      <w:r>
+        <w:t>listeSortiesNeureones</w:t>
+      </w:r>
+      <w:proofErr w:type="spellEnd"/>
+      <w:r>
+        <w:t>)</w:t>
+      </w:r>
+      <w:r>
+        <w:br/>
+        <w:t xml:space="preserve">        </w:t>
+      </w:r>
+      <w:proofErr w:type="spellStart"/>
+      <w:r>
+        <w:t>listeSortiesNeuronesPrev</w:t>
+      </w:r>
+      <w:proofErr w:type="spellEnd"/>
+      <w:r>
+        <w:t xml:space="preserve"> &lt;- </w:t>
+      </w:r>
+      <w:proofErr w:type="spellStart"/>
+      <w:r>
+        <w:t>listeSortiesNeurones</w:t>
+      </w:r>
+      <w:proofErr w:type="spellEnd"/>
+      <w:r>
+        <w:br/>
+        <w:t xml:space="preserve">        </w:t>
+      </w:r>
+      <w:r>
+        <w:rPr>
+          <w:b/>
+          <w:bCs/>
+        </w:rPr>
+        <w:t>Si</w:t>
+      </w:r>
+      <w:r>
+        <w:t xml:space="preserve"> </w:t>
+      </w:r>
+      <w:proofErr w:type="spellStart"/>
+      <w:r>
+        <w:t>estvide</w:t>
+      </w:r>
+      <w:proofErr w:type="spellEnd"/>
+      <w:r>
+        <w:t>(</w:t>
+      </w:r>
+      <w:proofErr w:type="spellStart"/>
+      <w:r>
+        <w:t>succ</w:t>
+      </w:r>
+      <w:proofErr w:type="spellEnd"/>
+      <w:r>
+        <w:t xml:space="preserve">(couche) </w:t>
+      </w:r>
+      <w:r>
+        <w:rPr>
+          <w:b/>
+          <w:bCs/>
+        </w:rPr>
+        <w:t>alors</w:t>
+      </w:r>
+      <w:r>
+        <w:t xml:space="preserve"> </w:t>
+      </w:r>
+      <w:r>
+        <w:br/>
+        <w:t xml:space="preserve">            </w:t>
+      </w:r>
+      <w:r>
+        <w:rPr>
+          <w:b/>
+          <w:bCs/>
+        </w:rPr>
+        <w:t>Pour</w:t>
+      </w:r>
+      <w:r>
+        <w:t xml:space="preserve"> i allant de 0 à </w:t>
+      </w:r>
+      <w:proofErr w:type="spellStart"/>
+      <w:r>
+        <w:t>nbNeurone</w:t>
+      </w:r>
+      <w:proofErr w:type="spellEnd"/>
+      <w:r>
+        <w:t xml:space="preserve">(couche) -1 </w:t>
+      </w:r>
+      <w:r>
+        <w:rPr>
+          <w:b/>
+          <w:bCs/>
+        </w:rPr>
+        <w:t>faire</w:t>
+      </w:r>
+      <w:r>
+        <w:br/>
+        <w:t xml:space="preserve">                Ecrire(Sortie du réseau « i+1 » : « </w:t>
+      </w:r>
+      <w:proofErr w:type="spellStart"/>
+      <w:r>
+        <w:t>listeSortiesNeurones</w:t>
+      </w:r>
+      <w:proofErr w:type="spellEnd"/>
+      <w:r>
+        <w:t>[i] »)</w:t>
+      </w:r>
+      <w:r>
+        <w:br/>
+        <w:t xml:space="preserve">            </w:t>
+      </w:r>
+      <w:r>
+        <w:rPr>
+          <w:b/>
+          <w:bCs/>
+        </w:rPr>
+        <w:t>Fin Pour</w:t>
+      </w:r>
+      <w:r>
+        <w:br/>
+        <w:t xml:space="preserve">        </w:t>
+      </w:r>
+      <w:r>
+        <w:rPr>
+          <w:b/>
+          <w:bCs/>
+        </w:rPr>
+        <w:t>Fin Si</w:t>
+      </w:r>
+      <w:r>
+        <w:br/>
+        <w:t xml:space="preserve">        Couche&lt;-</w:t>
+      </w:r>
+      <w:proofErr w:type="spellStart"/>
+      <w:r>
+        <w:t>succ</w:t>
+      </w:r>
+      <w:proofErr w:type="spellEnd"/>
+      <w:r>
+        <w:t>(couche)</w:t>
+      </w:r>
+      <w:r>
+        <w:br/>
+      </w:r>
+      <w:r>
+        <w:rPr>
+          <w:b/>
+          <w:bCs/>
+        </w:rPr>
+        <w:t>Fin Tant que</w:t>
+      </w:r>
+      <w:r>
+        <w:rPr>
+          <w:b/>
+          <w:bCs/>
+        </w:rPr>
+        <w:br/>
+        <w:t>Fin</w:t>
       </w:r>
     </w:p>
+    <w:p/>
     <w:p>
       <w:pPr>
         <w:pStyle w:val="Titre1"/>
@@ -4105,6 +4463,7 @@
         </w:numPr>
       </w:pPr>
       <w:r>
+        <w:lastRenderedPageBreak/>
         <w:t>Un poids de 1 pour chaque entrée</w:t>
       </w:r>
     </w:p>
@@ -4223,7 +4582,6 @@
     </w:p>
     <w:p>
       <w:r>
-        <w:lastRenderedPageBreak/>
         <w:t>Interprétation :</w:t>
       </w:r>
     </w:p>
@@ -4379,6 +4737,7 @@
       </w:pPr>
       <w:bookmarkStart w:id="16" w:name="_Toc183100811"/>
       <w:r>
+        <w:lastRenderedPageBreak/>
         <w:t xml:space="preserve">Réseau </w:t>
       </w:r>
       <w:proofErr w:type="spellStart"/>
@@ -4506,7 +4865,6 @@
     </w:p>
     <w:p>
       <w:r>
-        <w:lastRenderedPageBreak/>
         <w:t>Troisième couche :</w:t>
       </w:r>
     </w:p>
@@ -4522,8 +4880,63 @@
         <w:t>Seuil et unique neurone (OU) avec une liste de poids égale à [1,1] et un seuil fixé à 1</w:t>
       </w:r>
     </w:p>
+    <w:p/>
     <w:p>
       <w:r>
+        <w:t>Illustration :</w:t>
+      </w:r>
+      <w:r>
+        <w:br/>
+      </w:r>
+      <w:r>
+        <w:br/>
+      </w:r>
+      <w:r>
+        <w:drawing>
+          <wp:inline distT="0" distB="0" distL="0" distR="0" wp14:anchorId="2D702992" wp14:editId="39EC1A78">
+            <wp:extent cx="5760720" cy="2618105"/>
+            <wp:effectExtent l="0" t="0" r="0" b="0"/>
+            <wp:docPr id="396514559" name="Image 1" descr="Une image contenant croquis, dessin, Dessin au trait, diagramme&#10;&#10;Description générée automatiquement"/>
+            <wp:cNvGraphicFramePr>
+              <a:graphicFrameLocks xmlns:a="http://schemas.openxmlformats.org/drawingml/2006/main" noChangeAspect="1"/>
+            </wp:cNvGraphicFramePr>
+            <a:graphic xmlns:a="http://schemas.openxmlformats.org/drawingml/2006/main">
+              <a:graphicData uri="http://schemas.openxmlformats.org/drawingml/2006/picture">
+                <pic:pic xmlns:pic="http://schemas.openxmlformats.org/drawingml/2006/picture">
+                  <pic:nvPicPr>
+                    <pic:cNvPr id="396514559" name="Image 1" descr="Une image contenant croquis, dessin, Dessin au trait, diagramme&#10;&#10;Description générée automatiquement"/>
+                    <pic:cNvPicPr/>
+                  </pic:nvPicPr>
+                  <pic:blipFill>
+                    <a:blip r:embed="rId9"/>
+                    <a:stretch>
+                      <a:fillRect/>
+                    </a:stretch>
+                  </pic:blipFill>
+                  <pic:spPr>
+                    <a:xfrm>
+                      <a:off x="0" y="0"/>
+                      <a:ext cx="5760720" cy="2618105"/>
+                    </a:xfrm>
+                    <a:prstGeom prst="rect">
+                      <a:avLst/>
+                    </a:prstGeom>
+                  </pic:spPr>
+                </pic:pic>
+              </a:graphicData>
+            </a:graphic>
+          </wp:inline>
+        </w:drawing>
+      </w:r>
+    </w:p>
+    <w:p>
+      <w:r>
+        <w:br/>
+      </w:r>
+    </w:p>
+    <w:p>
+      <w:r>
+        <w:lastRenderedPageBreak/>
         <w:t>Interprétation :</w:t>
       </w:r>
     </w:p>
@@ -4694,7 +5107,6 @@
         <w:rPr>
           <w:noProof/>
         </w:rPr>
-        <w:lastRenderedPageBreak/>
         <w:drawing>
           <wp:anchor distT="0" distB="0" distL="114300" distR="114300" simplePos="0" relativeHeight="251658240" behindDoc="0" locked="0" layoutInCell="1" allowOverlap="1" wp14:anchorId="31615330" wp14:editId="3109C680">
             <wp:simplePos x="0" y="0"/>
@@ -4719,7 +5131,7 @@
                     <pic:cNvPicPr/>
                   </pic:nvPicPr>
                   <pic:blipFill>
-                    <a:blip r:embed="rId9">
+                    <a:blip r:embed="rId10">
                       <a:extLst>
                         <a:ext uri="{28A0092B-C50C-407E-A947-70E740481C1C}">
                           <a14:useLocalDpi xmlns:a14="http://schemas.microsoft.com/office/drawing/2010/main" val="0"/>
@@ -4750,7 +5162,7 @@
       </w:r>
     </w:p>
     <w:sectPr>
-      <w:footerReference w:type="default" r:id="rId10"/>
+      <w:footerReference w:type="default" r:id="rId11"/>
       <w:pgSz w:w="11906" w:h="16838"/>
       <w:pgMar w:top="1417" w:right="1417" w:bottom="1417" w:left="1417" w:header="708" w:footer="708" w:gutter="0"/>
       <w:pgNumType w:start="0"/>
@@ -8184,6 +8596,7 @@
   <w:style w:type="character" w:default="1" w:styleId="Policepardfaut">
     <w:name w:val="Default Paragraph Font"/>
     <w:uiPriority w:val="1"/>
+    <w:semiHidden/>
     <w:unhideWhenUsed/>
   </w:style>
   <w:style w:type="table" w:default="1" w:styleId="TableauNormal">
@@ -8900,19 +9313,23 @@
     <w:rsid w:val="00015491"/>
     <w:rsid w:val="0004796F"/>
     <w:rsid w:val="0006516D"/>
+    <w:rsid w:val="000E1C00"/>
     <w:rsid w:val="00120A07"/>
     <w:rsid w:val="00180CED"/>
     <w:rsid w:val="001F41DD"/>
     <w:rsid w:val="002030CA"/>
     <w:rsid w:val="00235B1D"/>
+    <w:rsid w:val="00303EA6"/>
     <w:rsid w:val="003B7B5A"/>
     <w:rsid w:val="00467C6E"/>
+    <w:rsid w:val="005174ED"/>
     <w:rsid w:val="00535A86"/>
     <w:rsid w:val="007217F5"/>
     <w:rsid w:val="00757A89"/>
     <w:rsid w:val="007632B8"/>
     <w:rsid w:val="00793A24"/>
     <w:rsid w:val="00807545"/>
+    <w:rsid w:val="00841657"/>
     <w:rsid w:val="008B7CFE"/>
     <w:rsid w:val="00970344"/>
     <w:rsid w:val="009874E3"/>

</xml_diff>